<commit_message>
Final review and recall.
</commit_message>
<xml_diff>
--- a/Косенко_НИ_Отзыв.docx
+++ b/Косенко_НИ_Отзыв.docx
@@ -29,6 +29,13 @@
           <w:szCs w:val="28"/>
         </w:rPr>
       </w:r>
+      <w:r>
+        <w:rPr>
+          <w:rFonts w:ascii="Times New Roman" w:hAnsi="Times New Roman" w:cs="Times New Roman"/>
+          <w:sz w:val="28"/>
+          <w:szCs w:val="28"/>
+        </w:rPr>
+      </w:r>
     </w:p>
     <w:p>
       <w:pPr>
@@ -53,16 +60,17 @@
       </w:r>
       <w:r>
         <w:rPr>
-          <w:rFonts w:ascii="Times New Roman" w:hAnsi="Times New Roman" w:eastAsia="Times New Roman" w:cs="Times New Roman"/>
+          <w:rFonts w:ascii="Times New Roman" w:hAnsi="Times New Roman" w:cs="Times New Roman"/>
           <w:sz w:val="28"/>
           <w:szCs w:val="28"/>
         </w:rPr>
       </w:r>
       <w:r>
         <w:rPr>
-          <w:rFonts w:ascii="Times New Roman" w:hAnsi="Times New Roman" w:cs="Times New Roman"/>
+          <w:rFonts w:ascii="Times New Roman" w:hAnsi="Times New Roman" w:eastAsia="Times New Roman" w:cs="Times New Roman"/>
           <w:sz w:val="28"/>
           <w:szCs w:val="28"/>
+          <w:highlight w:val="none"/>
         </w:rPr>
       </w:r>
     </w:p>
@@ -119,12 +127,6 @@
       </w:r>
       <w:r>
         <w:rPr>
-          <w:b/>
-          <w:bCs/>
-        </w:rPr>
-      </w:r>
-      <w:r>
-        <w:rPr>
           <w:rFonts w:ascii="Times New Roman" w:hAnsi="Times New Roman" w:eastAsia="Times New Roman" w:cs="Times New Roman"/>
           <w:b/>
           <w:bCs/>
@@ -134,17 +136,6 @@
           <w:lang w:val="en-US"/>
         </w:rPr>
         <w:t xml:space="preserve">»</w:t>
-      </w:r>
-      <w:r>
-        <w:rPr>
-          <w:rFonts w:ascii="Times New Roman" w:hAnsi="Times New Roman" w:eastAsia="Times New Roman" w:cs="Times New Roman"/>
-          <w:b/>
-          <w:bCs/>
-          <w:sz w:val="28"/>
-          <w:szCs w:val="28"/>
-          <w:highlight w:val="none"/>
-          <w:lang w:val="en-US"/>
-        </w:rPr>
       </w:r>
       <w:r>
         <w:rPr>
@@ -169,8 +160,9 @@
     </w:p>
     <w:p>
       <w:pPr>
-        <w:pBdr/>
-        <w:spacing/>
+        <w:suppressLineNumbers w:val="false"/>
+        <w:pBdr/>
+        <w:spacing w:after="57" w:before="0" w:line="276" w:lineRule="auto"/>
         <w:ind w:right="0" w:firstLine="709" w:left="0"/>
         <w:jc w:val="both"/>
         <w:rPr>
@@ -180,7 +172,6 @@
           <w:sz w:val="28"/>
           <w:szCs w:val="28"/>
           <w:highlight w:val="none"/>
-          <w:lang w:val="ru-RU"/>
         </w:rPr>
       </w:pPr>
       <w:r>
@@ -202,7 +193,40 @@
           <w:szCs w:val="28"/>
           <w:highlight w:val="none"/>
         </w:rPr>
-        <w:t xml:space="preserve">Современные информационные системы обрабатывают всё большие объёмы данных, что предъявляет повышенные требования к производительности систем управления базами данных. Одной из наиболее распространённых реляционных систем управления базами данных является PostgreSQL, которая активно и</w:t>
+        <w:t xml:space="preserve">С</w:t>
+      </w:r>
+      <w:r>
+        <w:rPr>
+          <w:rFonts w:ascii="Times New Roman" w:hAnsi="Times New Roman" w:eastAsia="Times New Roman" w:cs="Times New Roman"/>
+          <w:b w:val="0"/>
+          <w:bCs w:val="0"/>
+          <w:sz w:val="28"/>
+          <w:szCs w:val="28"/>
+          <w:highlight w:val="none"/>
+        </w:rPr>
+        <w:t xml:space="preserve">овременные информационные с</w:t>
+      </w:r>
+      <w:r>
+        <w:rPr>
+          <w:rFonts w:ascii="Times New Roman" w:hAnsi="Times New Roman" w:eastAsia="Times New Roman" w:cs="Times New Roman"/>
+          <w:b w:val="0"/>
+          <w:bCs w:val="0"/>
+          <w:sz w:val="28"/>
+          <w:szCs w:val="28"/>
+          <w:highlight w:val="none"/>
+        </w:rPr>
+        <w:t xml:space="preserve">истемы обрабатывают </w:t>
+      </w:r>
+      <w:r>
+        <w:rPr>
+          <w:rFonts w:ascii="Times New Roman" w:hAnsi="Times New Roman" w:eastAsia="Times New Roman" w:cs="Times New Roman"/>
+          <w:b w:val="0"/>
+          <w:bCs w:val="0"/>
+          <w:sz w:val="28"/>
+          <w:szCs w:val="28"/>
+          <w:highlight w:val="none"/>
+        </w:rPr>
+        <w:t xml:space="preserve">большие данных, что предъявляет повышенные требования к производительности систем управления базами данных. Одной из наиболее распространённых реляционных систем управления базами данных является PostgreSQL, которая активно и</w:t>
       </w:r>
       <w:r>
         <w:rPr>
@@ -283,11 +307,24 @@
           <w:highlight w:val="none"/>
         </w:rPr>
       </w:r>
+      <w:r>
+        <w:rPr>
+          <w:rFonts w:ascii="Times New Roman" w:hAnsi="Times New Roman" w:eastAsia="Times New Roman" w:cs="Times New Roman"/>
+          <w:b w:val="0"/>
+          <w:bCs w:val="0"/>
+          <w:sz w:val="28"/>
+          <w:szCs w:val="28"/>
+          <w:highlight w:val="none"/>
+          <w:lang w:val="ru-RU"/>
+        </w:rPr>
+      </w:r>
     </w:p>
     <w:p>
       <w:pPr>
-        <w:pBdr/>
-        <w:spacing/>
+        <w:keepLines w:val="true"/>
+        <w:suppressLineNumbers w:val="false"/>
+        <w:pBdr/>
+        <w:spacing w:after="57" w:before="0" w:line="276" w:lineRule="auto"/>
         <w:ind w:firstLine="708"/>
         <w:jc w:val="both"/>
         <w:rPr>
@@ -297,7 +334,6 @@
           <w:sz w:val="28"/>
           <w:szCs w:val="28"/>
           <w:highlight w:val="none"/>
-          <w:lang w:val="en-US"/>
         </w:rPr>
       </w:pPr>
       <w:r>
@@ -394,11 +430,23 @@
           <w:highlight w:val="none"/>
         </w:rPr>
       </w:r>
+      <w:r>
+        <w:rPr>
+          <w:rFonts w:ascii="Times New Roman" w:hAnsi="Times New Roman" w:eastAsia="Times New Roman" w:cs="Times New Roman"/>
+          <w:b w:val="0"/>
+          <w:bCs w:val="0"/>
+          <w:sz w:val="28"/>
+          <w:szCs w:val="28"/>
+          <w:highlight w:val="none"/>
+          <w:lang w:val="en-US"/>
+        </w:rPr>
+      </w:r>
     </w:p>
     <w:p>
       <w:pPr>
-        <w:pBdr/>
-        <w:spacing/>
+        <w:suppressLineNumbers w:val="false"/>
+        <w:pBdr/>
+        <w:spacing w:after="57" w:before="0" w:line="276" w:lineRule="auto"/>
         <w:ind w:firstLine="708"/>
         <w:jc w:val="both"/>
         <w:rPr>
@@ -408,7 +456,6 @@
           <w:sz w:val="28"/>
           <w:szCs w:val="28"/>
           <w:highlight w:val="none"/>
-          <w:lang w:val="en-US"/>
         </w:rPr>
       </w:pPr>
       <w:r>
@@ -457,11 +504,23 @@
           <w:highlight w:val="none"/>
         </w:rPr>
       </w:r>
+      <w:r>
+        <w:rPr>
+          <w:rFonts w:ascii="Times New Roman" w:hAnsi="Times New Roman" w:eastAsia="Times New Roman" w:cs="Times New Roman"/>
+          <w:b w:val="0"/>
+          <w:bCs w:val="0"/>
+          <w:sz w:val="28"/>
+          <w:szCs w:val="28"/>
+          <w:highlight w:val="none"/>
+          <w:lang w:val="en-US"/>
+        </w:rPr>
+      </w:r>
     </w:p>
     <w:p>
       <w:pPr>
-        <w:pBdr/>
-        <w:spacing/>
+        <w:suppressLineNumbers w:val="false"/>
+        <w:pBdr/>
+        <w:spacing w:after="57" w:before="0" w:line="276" w:lineRule="auto"/>
         <w:ind w:firstLine="708"/>
         <w:jc w:val="both"/>
         <w:rPr>
@@ -471,7 +530,6 @@
           <w:sz w:val="28"/>
           <w:szCs w:val="28"/>
           <w:highlight w:val="none"/>
-          <w:lang w:val="ru-RU"/>
         </w:rPr>
       </w:pPr>
       <w:r>
@@ -484,7 +542,19 @@
           <w:highlight w:val="none"/>
           <w:lang w:val="ru-RU"/>
         </w:rPr>
-        <w:t xml:space="preserve">В качестве недостатков  работы следует отметить неполную реализацию работы с большими кортежами в разработанном методе доступа и неполную реализацию свойства изолированности транзакций. Однако данные недостатки не снижают высокого уровня проделанной работы.</w:t>
+        <w:t xml:space="preserve">В</w:t>
+      </w:r>
+      <w:r>
+        <w:rPr>
+          <w:rFonts w:ascii="Times New Roman" w:hAnsi="Times New Roman" w:eastAsia="Times New Roman" w:cs="Times New Roman"/>
+          <w:b w:val="0"/>
+          <w:bCs w:val="0"/>
+          <w:sz w:val="28"/>
+          <w:szCs w:val="28"/>
+          <w:highlight w:val="none"/>
+          <w:lang w:val="ru-RU"/>
+        </w:rPr>
+        <w:t xml:space="preserve"> качестве недостатков  работы следует отметить неполную реализацию работы с большими кортежами в разработанном методе доступа и неполную реализацию свойства изолированности транзакций. Однако данные недостатки не снижают высокого уровня проделанной работы.</w:t>
       </w:r>
       <w:r>
         <w:rPr>
@@ -496,14 +566,33 @@
           <w:highlight w:val="none"/>
         </w:rPr>
       </w:r>
+      <w:r>
+        <w:rPr>
+          <w:rFonts w:ascii="Times New Roman" w:hAnsi="Times New Roman" w:eastAsia="Times New Roman" w:cs="Times New Roman"/>
+          <w:b w:val="0"/>
+          <w:bCs w:val="0"/>
+          <w:sz w:val="28"/>
+          <w:szCs w:val="28"/>
+          <w:highlight w:val="none"/>
+          <w:lang w:val="ru-RU"/>
+        </w:rPr>
+      </w:r>
     </w:p>
     <w:p>
       <w:pPr>
-        <w:pBdr/>
-        <w:spacing/>
+        <w:suppressLineNumbers w:val="false"/>
+        <w:pBdr/>
+        <w:spacing w:after="57" w:before="0" w:line="276" w:lineRule="auto"/>
         <w:ind w:firstLine="708"/>
         <w:jc w:val="both"/>
-        <w:rPr/>
+        <w:rPr>
+          <w:rFonts w:ascii="Times New Roman" w:hAnsi="Times New Roman" w:eastAsia="Times New Roman" w:cs="Times New Roman"/>
+          <w:b w:val="0"/>
+          <w:bCs w:val="0"/>
+          <w:sz w:val="28"/>
+          <w:szCs w:val="28"/>
+          <w:highlight w:val="none"/>
+        </w:rPr>
       </w:pPr>
       <w:r>
         <w:rPr>
@@ -527,7 +616,19 @@
           <w:highlight w:val="none"/>
           <w:lang w:val="ru-RU"/>
         </w:rPr>
-        <w:t xml:space="preserve">листом. Считаю, что выпускная квалификационная работа заслуживает оценки «отлично» (A, </w:t>
+        <w:t xml:space="preserve">листом. Считаю, что выпускная квалификационная работа заслуживает оценки «хорошо» (В, </w:t>
+      </w:r>
+      <w:r>
+        <w:rPr>
+          <w:rFonts w:ascii="Times New Roman" w:hAnsi="Times New Roman" w:eastAsia="Times New Roman" w:cs="Times New Roman"/>
+          <w:b w:val="0"/>
+          <w:bCs w:val="0"/>
+          <w:sz w:val="28"/>
+          <w:szCs w:val="28"/>
+          <w:highlight w:val="none"/>
+          <w:lang w:val="en-US"/>
+        </w:rPr>
+        <w:t xml:space="preserve">87</w:t>
       </w:r>
       <w:r>
         <w:rPr>
@@ -539,7 +640,7 @@
           <w:highlight w:val="none"/>
           <w:lang w:val="ru-RU"/>
         </w:rPr>
-        <w:t xml:space="preserve">97 баллов), а Косенко Н. И. — присвоения квалификации (степени) «магистр» по направлению </w:t>
+        <w:t xml:space="preserve"> баллов), а Косенко Н. И. — присвоения квалификации (степени) «магистр» по направлению </w:t>
       </w:r>
       <w:r>
         <w:rPr>
@@ -551,7 +652,7 @@
           <w:highlight w:val="none"/>
           <w:lang w:val="ru-RU"/>
         </w:rPr>
-        <w:t xml:space="preserve">подготовки (специальности) 09.04.04 «Программная инженерия» и рекомендации для поступле</w:t>
+        <w:t xml:space="preserve">подготовки (специальности) 09.04.04 «Программная инженерия»</w:t>
       </w:r>
       <w:r>
         <w:rPr>
@@ -563,9 +664,8 @@
           <w:highlight w:val="none"/>
           <w:lang w:val="ru-RU"/>
         </w:rPr>
-        <w:t xml:space="preserve">ния в аспирантуру.</w:t>
+        <w:t xml:space="preserve">.</w:t>
       </w:r>
-      <w:r/>
       <w:r>
         <w:rPr>
           <w:rFonts w:ascii="Times New Roman" w:hAnsi="Times New Roman" w:eastAsia="Times New Roman" w:cs="Times New Roman"/>
@@ -575,6 +675,28 @@
           <w:szCs w:val="28"/>
           <w:highlight w:val="none"/>
           <w:lang w:val="ru-RU"/>
+        </w:rPr>
+      </w:r>
+      <w:r>
+        <w:rPr>
+          <w:rFonts w:ascii="Times New Roman" w:hAnsi="Times New Roman" w:eastAsia="Times New Roman" w:cs="Times New Roman"/>
+          <w:b w:val="0"/>
+          <w:bCs w:val="0"/>
+          <w:sz w:val="28"/>
+          <w:szCs w:val="28"/>
+          <w:highlight w:val="none"/>
+          <w:lang w:val="ru-RU" w:bidi="ru-RU"/>
+        </w:rPr>
+      </w:r>
+      <w:r>
+        <w:rPr>
+          <w:rFonts w:ascii="Times New Roman" w:hAnsi="Times New Roman" w:eastAsia="Times New Roman" w:cs="Times New Roman"/>
+          <w:b w:val="0"/>
+          <w:bCs w:val="0"/>
+          <w:sz w:val="28"/>
+          <w:szCs w:val="28"/>
+          <w:highlight w:val="none"/>
+          <w:lang w:val="ru-RU" w:bidi="ru-RU"/>
         </w:rPr>
       </w:r>
       <w:r>
@@ -596,8 +718,86 @@
           <w:sz w:val="28"/>
           <w:szCs w:val="28"/>
           <w:highlight w:val="none"/>
+        </w:rPr>
+      </w:r>
+    </w:p>
+    <w:p>
+      <w:pPr>
+        <w:suppressLineNumbers w:val="false"/>
+        <w:pBdr/>
+        <w:spacing w:after="11" w:afterLines="0" w:before="0" w:beforeLines="0" w:line="276" w:lineRule="auto"/>
+        <w:ind w:firstLine="0"/>
+        <w:jc w:val="both"/>
+        <w:rPr>
+          <w:rFonts w:ascii="Times New Roman" w:hAnsi="Times New Roman" w:eastAsia="Times New Roman" w:cs="Times New Roman"/>
+          <w:b w:val="0"/>
+          <w:bCs w:val="0"/>
+          <w:sz w:val="6"/>
+          <w:szCs w:val="6"/>
+          <w:highlight w:val="none"/>
+        </w:rPr>
+      </w:pPr>
+      <w:r>
+        <w:rPr>
+          <w:rFonts w:ascii="Times New Roman" w:hAnsi="Times New Roman" w:eastAsia="Times New Roman" w:cs="Times New Roman"/>
+          <w:b w:val="0"/>
+          <w:bCs w:val="0"/>
+          <w:sz w:val="22"/>
+          <w:szCs w:val="22"/>
+          <w:highlight w:val="none"/>
           <w:lang w:val="ru-RU"/>
         </w:rPr>
+      </w:r>
+      <w:r>
+        <w:rPr>
+          <w:rFonts w:ascii="Times New Roman" w:hAnsi="Times New Roman" w:eastAsia="Times New Roman" w:cs="Times New Roman"/>
+          <w:b w:val="0"/>
+          <w:bCs w:val="0"/>
+          <w:sz w:val="6"/>
+          <w:szCs w:val="6"/>
+          <w:highlight w:val="none"/>
+          <w:lang w:val="ru-RU"/>
+        </w:rPr>
+      </w:r>
+      <w:r>
+        <w:rPr>
+          <w:rFonts w:ascii="Times New Roman" w:hAnsi="Times New Roman" w:eastAsia="Times New Roman" w:cs="Times New Roman"/>
+          <w:b w:val="0"/>
+          <w:bCs w:val="0"/>
+          <w:sz w:val="6"/>
+          <w:szCs w:val="6"/>
+          <w:highlight w:val="none"/>
+        </w:rPr>
+      </w:r>
+    </w:p>
+    <w:p>
+      <w:pPr>
+        <w:suppressLineNumbers w:val="false"/>
+        <w:pBdr/>
+        <w:spacing w:after="11" w:before="0" w:line="276" w:lineRule="auto"/>
+        <w:ind w:firstLine="0"/>
+        <w:jc w:val="both"/>
+        <w:rPr>
+          <w:rFonts w:ascii="Times New Roman" w:hAnsi="Times New Roman" w:eastAsia="Times New Roman" w:cs="Times New Roman"/>
+          <w:b w:val="0"/>
+          <w:bCs w:val="0"/>
+          <w:sz w:val="28"/>
+          <w:szCs w:val="28"/>
+          <w:highlight w:val="none"/>
+          <w:lang w:val="ru-RU"/>
+        </w:rPr>
+      </w:pPr>
+      <w:r>
+        <w:rPr>
+          <w:rFonts w:ascii="Times New Roman" w:hAnsi="Times New Roman" w:eastAsia="Times New Roman" w:cs="Times New Roman"/>
+          <w:b w:val="0"/>
+          <w:bCs w:val="0"/>
+          <w:sz w:val="28"/>
+          <w:szCs w:val="28"/>
+          <w:highlight w:val="none"/>
+          <w:lang w:val="ru-RU"/>
+        </w:rPr>
+        <w:t xml:space="preserve">Научный руководитель,</w:t>
       </w:r>
       <w:r>
         <w:rPr>
@@ -611,12 +811,180 @@
         </w:rPr>
       </w:r>
     </w:p>
+    <w:p>
+      <w:pPr>
+        <w:suppressLineNumbers w:val="false"/>
+        <w:pBdr/>
+        <w:spacing w:after="11" w:before="0" w:line="276" w:lineRule="auto"/>
+        <w:ind w:firstLine="0"/>
+        <w:jc w:val="both"/>
+        <w:rPr>
+          <w:rFonts w:ascii="Times New Roman" w:hAnsi="Times New Roman" w:eastAsia="Times New Roman" w:cs="Times New Roman"/>
+          <w:b w:val="0"/>
+          <w:bCs w:val="0"/>
+          <w:sz w:val="28"/>
+          <w:szCs w:val="28"/>
+          <w:highlight w:val="none"/>
+          <w:lang w:val="ru-RU" w:bidi="ru-RU"/>
+        </w:rPr>
+      </w:pPr>
+      <w:r>
+        <w:rPr>
+          <w:rFonts w:ascii="Times New Roman" w:hAnsi="Times New Roman" w:eastAsia="Times New Roman" w:cs="Times New Roman"/>
+          <w:b w:val="0"/>
+          <w:bCs w:val="0"/>
+          <w:sz w:val="28"/>
+          <w:szCs w:val="28"/>
+          <w:highlight w:val="none"/>
+          <w:lang w:val="ru-RU" w:bidi="ru-RU"/>
+        </w:rPr>
+        <w:t xml:space="preserve">к.т.н.</w:t>
+      </w:r>
+      <w:r>
+        <w:rPr>
+          <w:rFonts w:ascii="Times New Roman" w:hAnsi="Times New Roman" w:eastAsia="Times New Roman" w:cs="Times New Roman"/>
+          <w:b w:val="0"/>
+          <w:bCs w:val="0"/>
+          <w:sz w:val="28"/>
+          <w:szCs w:val="28"/>
+          <w:highlight w:val="none"/>
+          <w:lang w:val="ru-RU" w:bidi="ru-RU"/>
+        </w:rPr>
+        <w:t xml:space="preserve">, доцент кафедры «Кибернетика» </w:t>
+      </w:r>
+      <w:r>
+        <w:rPr>
+          <w:rFonts w:ascii="Times New Roman" w:hAnsi="Times New Roman" w:eastAsia="Times New Roman" w:cs="Times New Roman"/>
+          <w:b w:val="0"/>
+          <w:bCs w:val="0"/>
+          <w:sz w:val="28"/>
+          <w:szCs w:val="28"/>
+          <w:highlight w:val="none"/>
+          <w:lang w:val="ru-RU" w:bidi="ru-RU"/>
+        </w:rPr>
+      </w:r>
+      <w:r>
+        <w:rPr>
+          <w:rFonts w:ascii="Times New Roman" w:hAnsi="Times New Roman" w:eastAsia="Times New Roman" w:cs="Times New Roman"/>
+          <w:b w:val="0"/>
+          <w:bCs w:val="0"/>
+          <w:sz w:val="28"/>
+          <w:szCs w:val="28"/>
+          <w:highlight w:val="none"/>
+          <w:lang w:val="ru-RU" w:bidi="ru-RU"/>
+        </w:rPr>
+      </w:r>
+    </w:p>
+    <w:p>
+      <w:pPr>
+        <w:suppressLineNumbers w:val="false"/>
+        <w:pBdr/>
+        <w:spacing w:after="11" w:afterLines="0" w:before="0" w:beforeLines="0" w:line="276" w:lineRule="auto"/>
+        <w:ind w:firstLine="0"/>
+        <w:jc w:val="both"/>
+        <w:rPr>
+          <w:rFonts w:ascii="Times New Roman" w:hAnsi="Times New Roman" w:eastAsia="Times New Roman" w:cs="Times New Roman"/>
+          <w:b w:val="0"/>
+          <w:bCs w:val="0"/>
+          <w:sz w:val="28"/>
+          <w:szCs w:val="28"/>
+          <w:highlight w:val="none"/>
+          <w:lang w:val="ru-RU" w:bidi="ru-RU"/>
+        </w:rPr>
+      </w:pPr>
+      <w:r>
+        <w:rPr>
+          <w:rFonts w:ascii="Times New Roman" w:hAnsi="Times New Roman" w:eastAsia="Times New Roman" w:cs="Times New Roman"/>
+          <w:b w:val="0"/>
+          <w:bCs w:val="0"/>
+          <w:sz w:val="28"/>
+          <w:szCs w:val="28"/>
+          <w:highlight w:val="none"/>
+          <w:lang w:val="ru-RU" w:bidi="ru-RU"/>
+        </w:rPr>
+        <w:t xml:space="preserve">НИЯУ МИФИ</w:t>
+      </w:r>
+      <w:r>
+        <w:rPr>
+          <w:rFonts w:ascii="Times New Roman" w:hAnsi="Times New Roman" w:eastAsia="Times New Roman" w:cs="Times New Roman"/>
+          <w:b w:val="0"/>
+          <w:bCs w:val="0"/>
+          <w:sz w:val="28"/>
+          <w:szCs w:val="28"/>
+          <w:highlight w:val="none"/>
+          <w:lang w:val="ru-RU" w:bidi="ru-RU"/>
+        </w:rPr>
+      </w:r>
+      <w:r/>
+    </w:p>
+    <w:p>
+      <w:pPr>
+        <w:suppressLineNumbers w:val="false"/>
+        <w:pBdr/>
+        <w:spacing w:after="11" w:afterLines="0" w:before="0" w:beforeLines="0" w:line="276" w:lineRule="auto"/>
+        <w:ind w:firstLine="0"/>
+        <w:jc w:val="both"/>
+        <w:rPr>
+          <w:rFonts w:ascii="Times New Roman" w:hAnsi="Times New Roman" w:eastAsia="Times New Roman" w:cs="Times New Roman"/>
+          <w:b w:val="0"/>
+          <w:bCs w:val="0"/>
+          <w:sz w:val="28"/>
+          <w:szCs w:val="28"/>
+          <w:highlight w:val="none"/>
+          <w:lang w:val="ru-RU" w:bidi="ru-RU"/>
+        </w:rPr>
+      </w:pPr>
+      <w:r>
+        <w:rPr>
+          <w:rFonts w:ascii="Times New Roman" w:hAnsi="Times New Roman" w:eastAsia="Times New Roman" w:cs="Times New Roman"/>
+          <w:b w:val="0"/>
+          <w:bCs w:val="0"/>
+          <w:sz w:val="28"/>
+          <w:szCs w:val="28"/>
+          <w:highlight w:val="none"/>
+          <w:lang w:val="ru-RU" w:bidi="ru-RU"/>
+        </w:rPr>
+        <w:tab/>
+        <w:tab/>
+        <w:tab/>
+        <w:tab/>
+        <w:tab/>
+        <w:tab/>
+        <w:tab/>
+        <w:tab/>
+        <w:tab/>
+        <w:t xml:space="preserve">В.В. Климов</w:t>
+      </w:r>
+      <w:r>
+        <w:rPr>
+          <w:rFonts w:ascii="Times New Roman" w:hAnsi="Times New Roman" w:eastAsia="Times New Roman" w:cs="Times New Roman"/>
+          <w:b w:val="0"/>
+          <w:bCs w:val="0"/>
+          <w:sz w:val="28"/>
+          <w:szCs w:val="28"/>
+          <w:highlight w:val="none"/>
+          <w:lang w:val="en-US"/>
+        </w:rPr>
+        <w:t xml:space="preserve">/_____</w:t>
+      </w:r>
+      <w:r>
+        <w:rPr>
+          <w:rFonts w:ascii="Times New Roman" w:hAnsi="Times New Roman" w:eastAsia="Times New Roman" w:cs="Times New Roman"/>
+          <w:b w:val="0"/>
+          <w:bCs w:val="0"/>
+          <w:sz w:val="28"/>
+          <w:szCs w:val="28"/>
+          <w:highlight w:val="none"/>
+          <w:lang w:val="ru-RU" w:bidi="ru-RU"/>
+        </w:rPr>
+      </w:r>
+    </w:p>
     <w:sectPr>
       <w:footnotePr/>
       <w:endnotePr/>
       <w:type w:val="nextPage"/>
       <w:pgSz w:h="16838" w:orient="portrait" w:w="11906"/>
-      <w:pgMar w:top="1134" w:right="850" w:bottom="1134" w:left="1701" w:header="709" w:footer="709" w:gutter="0"/>
+      <w:pgMar w:top="1134" w:right="850" w:bottom="822" w:left="1701" w:header="709" w:footer="709" w:gutter="0"/>
       <w:cols w:num="1" w:sep="0" w:space="708" w:equalWidth="1"/>
     </w:sectPr>
   </w:body>
@@ -633,7 +1001,6 @@
         <w:ind/>
         <w:rPr/>
       </w:pPr>
-      <w:r/>
       <w:r>
         <w:separator/>
       </w:r>
@@ -648,7 +1015,6 @@
         <w:ind/>
         <w:rPr/>
       </w:pPr>
-      <w:r/>
       <w:r>
         <w:continuationSeparator/>
       </w:r>
@@ -668,7 +1034,6 @@
         <w:ind/>
         <w:rPr/>
       </w:pPr>
-      <w:r/>
       <w:r>
         <w:separator/>
       </w:r>
@@ -683,7 +1048,6 @@
         <w:ind/>
         <w:rPr/>
       </w:pPr>
-      <w:r/>
       <w:r>
         <w:continuationSeparator/>
       </w:r>
@@ -851,9 +1215,9 @@
     <w:lsdException w:name="Bibliography" w:uiPriority="37"/>
     <w:lsdException w:name="TOC Heading" w:uiPriority="39" w:qFormat="1"/>
   </w:latentStyles>
-  <w:style w:type="table" w:styleId="12">
+  <w:style w:type="table" w:styleId="701">
     <w:name w:val="Table Grid"/>
-    <w:basedOn w:val="665"/>
+    <w:basedOn w:val="887"/>
     <w:uiPriority w:val="59"/>
     <w:pPr>
       <w:pBdr/>
@@ -1050,9 +1414,9 @@
       </w:tcPr>
     </w:tblStylePr>
   </w:style>
-  <w:style w:type="table" w:styleId="13">
+  <w:style w:type="table" w:styleId="702">
     <w:name w:val="Table Grid Light"/>
-    <w:basedOn w:val="665"/>
+    <w:basedOn w:val="887"/>
     <w:uiPriority w:val="59"/>
     <w:pPr>
       <w:pBdr/>
@@ -1249,9 +1613,9 @@
       </w:tcPr>
     </w:tblStylePr>
   </w:style>
-  <w:style w:type="table" w:styleId="14">
+  <w:style w:type="table" w:styleId="703">
     <w:name w:val="Plain Table 1"/>
-    <w:basedOn w:val="665"/>
+    <w:basedOn w:val="887"/>
     <w:uiPriority w:val="59"/>
     <w:pPr>
       <w:pBdr/>
@@ -1474,9 +1838,9 @@
       </w:tcPr>
     </w:tblStylePr>
   </w:style>
-  <w:style w:type="table" w:styleId="15">
+  <w:style w:type="table" w:styleId="704">
     <w:name w:val="Plain Table 2"/>
-    <w:basedOn w:val="665"/>
+    <w:basedOn w:val="887"/>
     <w:uiPriority w:val="59"/>
     <w:pPr>
       <w:pBdr/>
@@ -1707,9 +2071,9 @@
       </w:tcPr>
     </w:tblStylePr>
   </w:style>
-  <w:style w:type="table" w:styleId="16">
+  <w:style w:type="table" w:styleId="705">
     <w:name w:val="Plain Table 3"/>
-    <w:basedOn w:val="665"/>
+    <w:basedOn w:val="887"/>
     <w:uiPriority w:val="99"/>
     <w:pPr>
       <w:pBdr/>
@@ -1937,9 +2301,9 @@
       </w:tcPr>
     </w:tblStylePr>
   </w:style>
-  <w:style w:type="table" w:styleId="17">
+  <w:style w:type="table" w:styleId="706">
     <w:name w:val="Plain Table 4"/>
-    <w:basedOn w:val="665"/>
+    <w:basedOn w:val="887"/>
     <w:uiPriority w:val="99"/>
     <w:pPr>
       <w:pBdr/>
@@ -2153,9 +2517,9 @@
       </w:tcPr>
     </w:tblStylePr>
   </w:style>
-  <w:style w:type="table" w:styleId="18">
+  <w:style w:type="table" w:styleId="707">
     <w:name w:val="Plain Table 5"/>
-    <w:basedOn w:val="665"/>
+    <w:basedOn w:val="887"/>
     <w:uiPriority w:val="99"/>
     <w:pPr>
       <w:pBdr/>
@@ -2386,9 +2750,9 @@
       </w:tcPr>
     </w:tblStylePr>
   </w:style>
-  <w:style w:type="table" w:styleId="19">
+  <w:style w:type="table" w:styleId="708">
     <w:name w:val="Grid Table 1 Light"/>
-    <w:basedOn w:val="665"/>
+    <w:basedOn w:val="887"/>
     <w:uiPriority w:val="99"/>
     <w:pPr>
       <w:pBdr/>
@@ -2609,9 +2973,9 @@
       </w:tcPr>
     </w:tblStylePr>
   </w:style>
-  <w:style w:type="table" w:styleId="20">
+  <w:style w:type="table" w:styleId="709">
     <w:name w:val="Grid Table 1 Light - Accent 1"/>
-    <w:basedOn w:val="665"/>
+    <w:basedOn w:val="887"/>
     <w:uiPriority w:val="99"/>
     <w:pPr>
       <w:pBdr/>
@@ -2832,9 +3196,9 @@
       </w:tcPr>
     </w:tblStylePr>
   </w:style>
-  <w:style w:type="table" w:styleId="21">
+  <w:style w:type="table" w:styleId="710">
     <w:name w:val="Grid Table 1 Light - Accent 2"/>
-    <w:basedOn w:val="665"/>
+    <w:basedOn w:val="887"/>
     <w:uiPriority w:val="99"/>
     <w:pPr>
       <w:pBdr/>
@@ -3055,9 +3419,9 @@
       </w:tcPr>
     </w:tblStylePr>
   </w:style>
-  <w:style w:type="table" w:styleId="22">
+  <w:style w:type="table" w:styleId="711">
     <w:name w:val="Grid Table 1 Light - Accent 3"/>
-    <w:basedOn w:val="665"/>
+    <w:basedOn w:val="887"/>
     <w:uiPriority w:val="99"/>
     <w:pPr>
       <w:pBdr/>
@@ -3278,9 +3642,9 @@
       </w:tcPr>
     </w:tblStylePr>
   </w:style>
-  <w:style w:type="table" w:styleId="23">
+  <w:style w:type="table" w:styleId="712">
     <w:name w:val="Grid Table 1 Light - Accent 4"/>
-    <w:basedOn w:val="665"/>
+    <w:basedOn w:val="887"/>
     <w:uiPriority w:val="99"/>
     <w:pPr>
       <w:pBdr/>
@@ -3501,9 +3865,9 @@
       </w:tcPr>
     </w:tblStylePr>
   </w:style>
-  <w:style w:type="table" w:styleId="24">
+  <w:style w:type="table" w:styleId="713">
     <w:name w:val="Grid Table 1 Light - Accent 5"/>
-    <w:basedOn w:val="665"/>
+    <w:basedOn w:val="887"/>
     <w:uiPriority w:val="99"/>
     <w:pPr>
       <w:pBdr/>
@@ -3724,9 +4088,9 @@
       </w:tcPr>
     </w:tblStylePr>
   </w:style>
-  <w:style w:type="table" w:styleId="25">
+  <w:style w:type="table" w:styleId="714">
     <w:name w:val="Grid Table 1 Light - Accent 6"/>
-    <w:basedOn w:val="665"/>
+    <w:basedOn w:val="887"/>
     <w:uiPriority w:val="99"/>
     <w:pPr>
       <w:pBdr/>
@@ -3947,9 +4311,9 @@
       </w:tcPr>
     </w:tblStylePr>
   </w:style>
-  <w:style w:type="table" w:styleId="26">
+  <w:style w:type="table" w:styleId="715">
     <w:name w:val="Grid Table 2"/>
-    <w:basedOn w:val="665"/>
+    <w:basedOn w:val="887"/>
     <w:uiPriority w:val="99"/>
     <w:pPr>
       <w:pBdr/>
@@ -4179,9 +4543,9 @@
       </w:tcPr>
     </w:tblStylePr>
   </w:style>
-  <w:style w:type="table" w:styleId="27">
+  <w:style w:type="table" w:styleId="716">
     <w:name w:val="Grid Table 2 - Accent 1"/>
-    <w:basedOn w:val="665"/>
+    <w:basedOn w:val="887"/>
     <w:uiPriority w:val="99"/>
     <w:pPr>
       <w:pBdr/>
@@ -4411,9 +4775,9 @@
       </w:tcPr>
     </w:tblStylePr>
   </w:style>
-  <w:style w:type="table" w:styleId="28">
+  <w:style w:type="table" w:styleId="717">
     <w:name w:val="Grid Table 2 - Accent 2"/>
-    <w:basedOn w:val="665"/>
+    <w:basedOn w:val="887"/>
     <w:uiPriority w:val="99"/>
     <w:pPr>
       <w:pBdr/>
@@ -4643,9 +5007,9 @@
       </w:tcPr>
     </w:tblStylePr>
   </w:style>
-  <w:style w:type="table" w:styleId="29">
+  <w:style w:type="table" w:styleId="718">
     <w:name w:val="Grid Table 2 - Accent 3"/>
-    <w:basedOn w:val="665"/>
+    <w:basedOn w:val="887"/>
     <w:uiPriority w:val="99"/>
     <w:pPr>
       <w:pBdr/>
@@ -4875,9 +5239,9 @@
       </w:tcPr>
     </w:tblStylePr>
   </w:style>
-  <w:style w:type="table" w:styleId="30">
+  <w:style w:type="table" w:styleId="719">
     <w:name w:val="Grid Table 2 - Accent 4"/>
-    <w:basedOn w:val="665"/>
+    <w:basedOn w:val="887"/>
     <w:uiPriority w:val="99"/>
     <w:pPr>
       <w:pBdr/>
@@ -5107,9 +5471,9 @@
       </w:tcPr>
     </w:tblStylePr>
   </w:style>
-  <w:style w:type="table" w:styleId="31">
+  <w:style w:type="table" w:styleId="720">
     <w:name w:val="Grid Table 2 - Accent 5"/>
-    <w:basedOn w:val="665"/>
+    <w:basedOn w:val="887"/>
     <w:uiPriority w:val="99"/>
     <w:pPr>
       <w:pBdr/>
@@ -5339,9 +5703,9 @@
       </w:tcPr>
     </w:tblStylePr>
   </w:style>
-  <w:style w:type="table" w:styleId="32">
+  <w:style w:type="table" w:styleId="721">
     <w:name w:val="Grid Table 2 - Accent 6"/>
-    <w:basedOn w:val="665"/>
+    <w:basedOn w:val="887"/>
     <w:uiPriority w:val="99"/>
     <w:pPr>
       <w:pBdr/>
@@ -5571,9 +5935,9 @@
       </w:tcPr>
     </w:tblStylePr>
   </w:style>
-  <w:style w:type="table" w:styleId="33">
+  <w:style w:type="table" w:styleId="722">
     <w:name w:val="Grid Table 3"/>
-    <w:basedOn w:val="665"/>
+    <w:basedOn w:val="887"/>
     <w:uiPriority w:val="99"/>
     <w:pPr>
       <w:pBdr/>
@@ -5672,29 +6036,6 @@
         <w:tblBorders/>
       </w:tblPr>
       <w:tcPr>
-        <w:shd w:color="ffffff"/>
-        <w:tcBorders>
-          <w:top w:val="none" w:color="000000" w:sz="4" w:space="0"/>
-          <w:left w:val="none" w:color="000000" w:sz="4" w:space="0"/>
-          <w:bottom w:val="none" w:color="000000" w:sz="4" w:space="0"/>
-          <w:right w:val="none" w:color="000000" w:sz="4" w:space="0"/>
-        </w:tcBorders>
-      </w:tcPr>
-    </w:tblStylePr>
-    <w:tblStylePr w:type="firstRow">
-      <w:rPr>
-        <w:b/>
-        <w:color w:val="404040"/>
-      </w:rPr>
-      <w:pPr>
-        <w:pBdr/>
-        <w:spacing/>
-        <w:ind/>
-      </w:pPr>
-      <w:tblPr>
-        <w:tblBorders/>
-      </w:tblPr>
-      <w:tcPr>
         <w:shd w:val="clear" w:color="ffffff"/>
         <w:tcBorders>
           <w:top w:val="none" w:color="000000" w:sz="4" w:space="0"/>
@@ -5704,30 +6045,7 @@
         </w:tcBorders>
       </w:tcPr>
     </w:tblStylePr>
-    <w:tblStylePr w:type="lastCol">
-      <w:rPr>
-        <w:i/>
-        <w:color w:val="404040"/>
-      </w:rPr>
-      <w:pPr>
-        <w:pBdr/>
-        <w:spacing/>
-        <w:ind/>
-      </w:pPr>
-      <w:tblPr>
-        <w:tblBorders/>
-      </w:tblPr>
-      <w:tcPr>
-        <w:shd w:color="ffffff"/>
-        <w:tcBorders>
-          <w:top w:val="none" w:color="000000" w:sz="4" w:space="0"/>
-          <w:left w:val="none" w:color="000000" w:sz="4" w:space="0"/>
-          <w:bottom w:val="none" w:color="000000" w:sz="4" w:space="0"/>
-          <w:right w:val="none" w:color="000000" w:sz="4" w:space="0"/>
-        </w:tcBorders>
-      </w:tcPr>
-    </w:tblStylePr>
-    <w:tblStylePr w:type="lastRow">
+    <w:tblStylePr w:type="firstRow">
       <w:rPr>
         <w:b/>
         <w:color w:val="404040"/>
@@ -5750,6 +6068,52 @@
         </w:tcBorders>
       </w:tcPr>
     </w:tblStylePr>
+    <w:tblStylePr w:type="lastCol">
+      <w:rPr>
+        <w:i/>
+        <w:color w:val="404040"/>
+      </w:rPr>
+      <w:pPr>
+        <w:pBdr/>
+        <w:spacing/>
+        <w:ind/>
+      </w:pPr>
+      <w:tblPr>
+        <w:tblBorders/>
+      </w:tblPr>
+      <w:tcPr>
+        <w:shd w:val="clear" w:color="ffffff"/>
+        <w:tcBorders>
+          <w:top w:val="none" w:color="000000" w:sz="4" w:space="0"/>
+          <w:left w:val="none" w:color="000000" w:sz="4" w:space="0"/>
+          <w:bottom w:val="none" w:color="000000" w:sz="4" w:space="0"/>
+          <w:right w:val="none" w:color="000000" w:sz="4" w:space="0"/>
+        </w:tcBorders>
+      </w:tcPr>
+    </w:tblStylePr>
+    <w:tblStylePr w:type="lastRow">
+      <w:rPr>
+        <w:b/>
+        <w:color w:val="404040"/>
+      </w:rPr>
+      <w:pPr>
+        <w:pBdr/>
+        <w:spacing/>
+        <w:ind/>
+      </w:pPr>
+      <w:tblPr>
+        <w:tblBorders/>
+      </w:tblPr>
+      <w:tcPr>
+        <w:shd w:val="clear" w:color="ffffff"/>
+        <w:tcBorders>
+          <w:top w:val="none" w:color="000000" w:sz="4" w:space="0"/>
+          <w:left w:val="none" w:color="000000" w:sz="4" w:space="0"/>
+          <w:bottom w:val="none" w:color="000000" w:sz="4" w:space="0"/>
+          <w:right w:val="none" w:color="000000" w:sz="4" w:space="0"/>
+        </w:tcBorders>
+      </w:tcPr>
+    </w:tblStylePr>
     <w:tblStylePr w:type="nwCell">
       <w:pPr>
         <w:pBdr/>
@@ -5816,9 +6180,9 @@
       </w:tcPr>
     </w:tblStylePr>
   </w:style>
-  <w:style w:type="table" w:styleId="34">
+  <w:style w:type="table" w:styleId="723">
     <w:name w:val="Grid Table 3 - Accent 1"/>
-    <w:basedOn w:val="665"/>
+    <w:basedOn w:val="887"/>
     <w:uiPriority w:val="99"/>
     <w:pPr>
       <w:pBdr/>
@@ -5917,29 +6281,6 @@
         <w:tblBorders/>
       </w:tblPr>
       <w:tcPr>
-        <w:shd w:color="ffffff"/>
-        <w:tcBorders>
-          <w:top w:val="none" w:color="000000" w:sz="4" w:space="0"/>
-          <w:left w:val="none" w:color="000000" w:sz="4" w:space="0"/>
-          <w:bottom w:val="none" w:color="000000" w:sz="4" w:space="0"/>
-          <w:right w:val="none" w:color="000000" w:sz="4" w:space="0"/>
-        </w:tcBorders>
-      </w:tcPr>
-    </w:tblStylePr>
-    <w:tblStylePr w:type="firstRow">
-      <w:rPr>
-        <w:b/>
-        <w:color w:val="404040"/>
-      </w:rPr>
-      <w:pPr>
-        <w:pBdr/>
-        <w:spacing/>
-        <w:ind/>
-      </w:pPr>
-      <w:tblPr>
-        <w:tblBorders/>
-      </w:tblPr>
-      <w:tcPr>
         <w:shd w:val="clear" w:color="ffffff"/>
         <w:tcBorders>
           <w:top w:val="none" w:color="000000" w:sz="4" w:space="0"/>
@@ -5949,30 +6290,7 @@
         </w:tcBorders>
       </w:tcPr>
     </w:tblStylePr>
-    <w:tblStylePr w:type="lastCol">
-      <w:rPr>
-        <w:i/>
-        <w:color w:val="404040"/>
-      </w:rPr>
-      <w:pPr>
-        <w:pBdr/>
-        <w:spacing/>
-        <w:ind/>
-      </w:pPr>
-      <w:tblPr>
-        <w:tblBorders/>
-      </w:tblPr>
-      <w:tcPr>
-        <w:shd w:color="ffffff"/>
-        <w:tcBorders>
-          <w:top w:val="none" w:color="000000" w:sz="4" w:space="0"/>
-          <w:left w:val="none" w:color="000000" w:sz="4" w:space="0"/>
-          <w:bottom w:val="none" w:color="000000" w:sz="4" w:space="0"/>
-          <w:right w:val="none" w:color="000000" w:sz="4" w:space="0"/>
-        </w:tcBorders>
-      </w:tcPr>
-    </w:tblStylePr>
-    <w:tblStylePr w:type="lastRow">
+    <w:tblStylePr w:type="firstRow">
       <w:rPr>
         <w:b/>
         <w:color w:val="404040"/>
@@ -5995,6 +6313,52 @@
         </w:tcBorders>
       </w:tcPr>
     </w:tblStylePr>
+    <w:tblStylePr w:type="lastCol">
+      <w:rPr>
+        <w:i/>
+        <w:color w:val="404040"/>
+      </w:rPr>
+      <w:pPr>
+        <w:pBdr/>
+        <w:spacing/>
+        <w:ind/>
+      </w:pPr>
+      <w:tblPr>
+        <w:tblBorders/>
+      </w:tblPr>
+      <w:tcPr>
+        <w:shd w:val="clear" w:color="ffffff"/>
+        <w:tcBorders>
+          <w:top w:val="none" w:color="000000" w:sz="4" w:space="0"/>
+          <w:left w:val="none" w:color="000000" w:sz="4" w:space="0"/>
+          <w:bottom w:val="none" w:color="000000" w:sz="4" w:space="0"/>
+          <w:right w:val="none" w:color="000000" w:sz="4" w:space="0"/>
+        </w:tcBorders>
+      </w:tcPr>
+    </w:tblStylePr>
+    <w:tblStylePr w:type="lastRow">
+      <w:rPr>
+        <w:b/>
+        <w:color w:val="404040"/>
+      </w:rPr>
+      <w:pPr>
+        <w:pBdr/>
+        <w:spacing/>
+        <w:ind/>
+      </w:pPr>
+      <w:tblPr>
+        <w:tblBorders/>
+      </w:tblPr>
+      <w:tcPr>
+        <w:shd w:val="clear" w:color="ffffff"/>
+        <w:tcBorders>
+          <w:top w:val="none" w:color="000000" w:sz="4" w:space="0"/>
+          <w:left w:val="none" w:color="000000" w:sz="4" w:space="0"/>
+          <w:bottom w:val="none" w:color="000000" w:sz="4" w:space="0"/>
+          <w:right w:val="none" w:color="000000" w:sz="4" w:space="0"/>
+        </w:tcBorders>
+      </w:tcPr>
+    </w:tblStylePr>
     <w:tblStylePr w:type="nwCell">
       <w:pPr>
         <w:pBdr/>
@@ -6061,9 +6425,9 @@
       </w:tcPr>
     </w:tblStylePr>
   </w:style>
-  <w:style w:type="table" w:styleId="35">
+  <w:style w:type="table" w:styleId="724">
     <w:name w:val="Grid Table 3 - Accent 2"/>
-    <w:basedOn w:val="665"/>
+    <w:basedOn w:val="887"/>
     <w:uiPriority w:val="99"/>
     <w:pPr>
       <w:pBdr/>
@@ -6162,29 +6526,6 @@
         <w:tblBorders/>
       </w:tblPr>
       <w:tcPr>
-        <w:shd w:color="ffffff"/>
-        <w:tcBorders>
-          <w:top w:val="none" w:color="000000" w:sz="4" w:space="0"/>
-          <w:left w:val="none" w:color="000000" w:sz="4" w:space="0"/>
-          <w:bottom w:val="none" w:color="000000" w:sz="4" w:space="0"/>
-          <w:right w:val="none" w:color="000000" w:sz="4" w:space="0"/>
-        </w:tcBorders>
-      </w:tcPr>
-    </w:tblStylePr>
-    <w:tblStylePr w:type="firstRow">
-      <w:rPr>
-        <w:b/>
-        <w:color w:val="404040"/>
-      </w:rPr>
-      <w:pPr>
-        <w:pBdr/>
-        <w:spacing/>
-        <w:ind/>
-      </w:pPr>
-      <w:tblPr>
-        <w:tblBorders/>
-      </w:tblPr>
-      <w:tcPr>
         <w:shd w:val="clear" w:color="ffffff"/>
         <w:tcBorders>
           <w:top w:val="none" w:color="000000" w:sz="4" w:space="0"/>
@@ -6194,30 +6535,7 @@
         </w:tcBorders>
       </w:tcPr>
     </w:tblStylePr>
-    <w:tblStylePr w:type="lastCol">
-      <w:rPr>
-        <w:i/>
-        <w:color w:val="404040"/>
-      </w:rPr>
-      <w:pPr>
-        <w:pBdr/>
-        <w:spacing/>
-        <w:ind/>
-      </w:pPr>
-      <w:tblPr>
-        <w:tblBorders/>
-      </w:tblPr>
-      <w:tcPr>
-        <w:shd w:color="ffffff"/>
-        <w:tcBorders>
-          <w:top w:val="none" w:color="000000" w:sz="4" w:space="0"/>
-          <w:left w:val="none" w:color="000000" w:sz="4" w:space="0"/>
-          <w:bottom w:val="none" w:color="000000" w:sz="4" w:space="0"/>
-          <w:right w:val="none" w:color="000000" w:sz="4" w:space="0"/>
-        </w:tcBorders>
-      </w:tcPr>
-    </w:tblStylePr>
-    <w:tblStylePr w:type="lastRow">
+    <w:tblStylePr w:type="firstRow">
       <w:rPr>
         <w:b/>
         <w:color w:val="404040"/>
@@ -6240,6 +6558,52 @@
         </w:tcBorders>
       </w:tcPr>
     </w:tblStylePr>
+    <w:tblStylePr w:type="lastCol">
+      <w:rPr>
+        <w:i/>
+        <w:color w:val="404040"/>
+      </w:rPr>
+      <w:pPr>
+        <w:pBdr/>
+        <w:spacing/>
+        <w:ind/>
+      </w:pPr>
+      <w:tblPr>
+        <w:tblBorders/>
+      </w:tblPr>
+      <w:tcPr>
+        <w:shd w:val="clear" w:color="ffffff"/>
+        <w:tcBorders>
+          <w:top w:val="none" w:color="000000" w:sz="4" w:space="0"/>
+          <w:left w:val="none" w:color="000000" w:sz="4" w:space="0"/>
+          <w:bottom w:val="none" w:color="000000" w:sz="4" w:space="0"/>
+          <w:right w:val="none" w:color="000000" w:sz="4" w:space="0"/>
+        </w:tcBorders>
+      </w:tcPr>
+    </w:tblStylePr>
+    <w:tblStylePr w:type="lastRow">
+      <w:rPr>
+        <w:b/>
+        <w:color w:val="404040"/>
+      </w:rPr>
+      <w:pPr>
+        <w:pBdr/>
+        <w:spacing/>
+        <w:ind/>
+      </w:pPr>
+      <w:tblPr>
+        <w:tblBorders/>
+      </w:tblPr>
+      <w:tcPr>
+        <w:shd w:val="clear" w:color="ffffff"/>
+        <w:tcBorders>
+          <w:top w:val="none" w:color="000000" w:sz="4" w:space="0"/>
+          <w:left w:val="none" w:color="000000" w:sz="4" w:space="0"/>
+          <w:bottom w:val="none" w:color="000000" w:sz="4" w:space="0"/>
+          <w:right w:val="none" w:color="000000" w:sz="4" w:space="0"/>
+        </w:tcBorders>
+      </w:tcPr>
+    </w:tblStylePr>
     <w:tblStylePr w:type="nwCell">
       <w:pPr>
         <w:pBdr/>
@@ -6306,9 +6670,9 @@
       </w:tcPr>
     </w:tblStylePr>
   </w:style>
-  <w:style w:type="table" w:styleId="36">
+  <w:style w:type="table" w:styleId="725">
     <w:name w:val="Grid Table 3 - Accent 3"/>
-    <w:basedOn w:val="665"/>
+    <w:basedOn w:val="887"/>
     <w:uiPriority w:val="99"/>
     <w:pPr>
       <w:pBdr/>
@@ -6407,29 +6771,6 @@
         <w:tblBorders/>
       </w:tblPr>
       <w:tcPr>
-        <w:shd w:color="ffffff"/>
-        <w:tcBorders>
-          <w:top w:val="none" w:color="000000" w:sz="4" w:space="0"/>
-          <w:left w:val="none" w:color="000000" w:sz="4" w:space="0"/>
-          <w:bottom w:val="none" w:color="000000" w:sz="4" w:space="0"/>
-          <w:right w:val="none" w:color="000000" w:sz="4" w:space="0"/>
-        </w:tcBorders>
-      </w:tcPr>
-    </w:tblStylePr>
-    <w:tblStylePr w:type="firstRow">
-      <w:rPr>
-        <w:b/>
-        <w:color w:val="404040"/>
-      </w:rPr>
-      <w:pPr>
-        <w:pBdr/>
-        <w:spacing/>
-        <w:ind/>
-      </w:pPr>
-      <w:tblPr>
-        <w:tblBorders/>
-      </w:tblPr>
-      <w:tcPr>
         <w:shd w:val="clear" w:color="ffffff"/>
         <w:tcBorders>
           <w:top w:val="none" w:color="000000" w:sz="4" w:space="0"/>
@@ -6439,30 +6780,7 @@
         </w:tcBorders>
       </w:tcPr>
     </w:tblStylePr>
-    <w:tblStylePr w:type="lastCol">
-      <w:rPr>
-        <w:i/>
-        <w:color w:val="404040"/>
-      </w:rPr>
-      <w:pPr>
-        <w:pBdr/>
-        <w:spacing/>
-        <w:ind/>
-      </w:pPr>
-      <w:tblPr>
-        <w:tblBorders/>
-      </w:tblPr>
-      <w:tcPr>
-        <w:shd w:color="ffffff"/>
-        <w:tcBorders>
-          <w:top w:val="none" w:color="000000" w:sz="4" w:space="0"/>
-          <w:left w:val="none" w:color="000000" w:sz="4" w:space="0"/>
-          <w:bottom w:val="none" w:color="000000" w:sz="4" w:space="0"/>
-          <w:right w:val="none" w:color="000000" w:sz="4" w:space="0"/>
-        </w:tcBorders>
-      </w:tcPr>
-    </w:tblStylePr>
-    <w:tblStylePr w:type="lastRow">
+    <w:tblStylePr w:type="firstRow">
       <w:rPr>
         <w:b/>
         <w:color w:val="404040"/>
@@ -6485,6 +6803,52 @@
         </w:tcBorders>
       </w:tcPr>
     </w:tblStylePr>
+    <w:tblStylePr w:type="lastCol">
+      <w:rPr>
+        <w:i/>
+        <w:color w:val="404040"/>
+      </w:rPr>
+      <w:pPr>
+        <w:pBdr/>
+        <w:spacing/>
+        <w:ind/>
+      </w:pPr>
+      <w:tblPr>
+        <w:tblBorders/>
+      </w:tblPr>
+      <w:tcPr>
+        <w:shd w:val="clear" w:color="ffffff"/>
+        <w:tcBorders>
+          <w:top w:val="none" w:color="000000" w:sz="4" w:space="0"/>
+          <w:left w:val="none" w:color="000000" w:sz="4" w:space="0"/>
+          <w:bottom w:val="none" w:color="000000" w:sz="4" w:space="0"/>
+          <w:right w:val="none" w:color="000000" w:sz="4" w:space="0"/>
+        </w:tcBorders>
+      </w:tcPr>
+    </w:tblStylePr>
+    <w:tblStylePr w:type="lastRow">
+      <w:rPr>
+        <w:b/>
+        <w:color w:val="404040"/>
+      </w:rPr>
+      <w:pPr>
+        <w:pBdr/>
+        <w:spacing/>
+        <w:ind/>
+      </w:pPr>
+      <w:tblPr>
+        <w:tblBorders/>
+      </w:tblPr>
+      <w:tcPr>
+        <w:shd w:val="clear" w:color="ffffff"/>
+        <w:tcBorders>
+          <w:top w:val="none" w:color="000000" w:sz="4" w:space="0"/>
+          <w:left w:val="none" w:color="000000" w:sz="4" w:space="0"/>
+          <w:bottom w:val="none" w:color="000000" w:sz="4" w:space="0"/>
+          <w:right w:val="none" w:color="000000" w:sz="4" w:space="0"/>
+        </w:tcBorders>
+      </w:tcPr>
+    </w:tblStylePr>
     <w:tblStylePr w:type="nwCell">
       <w:pPr>
         <w:pBdr/>
@@ -6551,9 +6915,9 @@
       </w:tcPr>
     </w:tblStylePr>
   </w:style>
-  <w:style w:type="table" w:styleId="37">
+  <w:style w:type="table" w:styleId="726">
     <w:name w:val="Grid Table 3 - Accent 4"/>
-    <w:basedOn w:val="665"/>
+    <w:basedOn w:val="887"/>
     <w:uiPriority w:val="99"/>
     <w:pPr>
       <w:pBdr/>
@@ -6652,29 +7016,6 @@
         <w:tblBorders/>
       </w:tblPr>
       <w:tcPr>
-        <w:shd w:color="ffffff"/>
-        <w:tcBorders>
-          <w:top w:val="none" w:color="000000" w:sz="4" w:space="0"/>
-          <w:left w:val="none" w:color="000000" w:sz="4" w:space="0"/>
-          <w:bottom w:val="none" w:color="000000" w:sz="4" w:space="0"/>
-          <w:right w:val="none" w:color="000000" w:sz="4" w:space="0"/>
-        </w:tcBorders>
-      </w:tcPr>
-    </w:tblStylePr>
-    <w:tblStylePr w:type="firstRow">
-      <w:rPr>
-        <w:b/>
-        <w:color w:val="404040"/>
-      </w:rPr>
-      <w:pPr>
-        <w:pBdr/>
-        <w:spacing/>
-        <w:ind/>
-      </w:pPr>
-      <w:tblPr>
-        <w:tblBorders/>
-      </w:tblPr>
-      <w:tcPr>
         <w:shd w:val="clear" w:color="ffffff"/>
         <w:tcBorders>
           <w:top w:val="none" w:color="000000" w:sz="4" w:space="0"/>
@@ -6684,30 +7025,7 @@
         </w:tcBorders>
       </w:tcPr>
     </w:tblStylePr>
-    <w:tblStylePr w:type="lastCol">
-      <w:rPr>
-        <w:i/>
-        <w:color w:val="404040"/>
-      </w:rPr>
-      <w:pPr>
-        <w:pBdr/>
-        <w:spacing/>
-        <w:ind/>
-      </w:pPr>
-      <w:tblPr>
-        <w:tblBorders/>
-      </w:tblPr>
-      <w:tcPr>
-        <w:shd w:color="ffffff"/>
-        <w:tcBorders>
-          <w:top w:val="none" w:color="000000" w:sz="4" w:space="0"/>
-          <w:left w:val="none" w:color="000000" w:sz="4" w:space="0"/>
-          <w:bottom w:val="none" w:color="000000" w:sz="4" w:space="0"/>
-          <w:right w:val="none" w:color="000000" w:sz="4" w:space="0"/>
-        </w:tcBorders>
-      </w:tcPr>
-    </w:tblStylePr>
-    <w:tblStylePr w:type="lastRow">
+    <w:tblStylePr w:type="firstRow">
       <w:rPr>
         <w:b/>
         <w:color w:val="404040"/>
@@ -6730,6 +7048,52 @@
         </w:tcBorders>
       </w:tcPr>
     </w:tblStylePr>
+    <w:tblStylePr w:type="lastCol">
+      <w:rPr>
+        <w:i/>
+        <w:color w:val="404040"/>
+      </w:rPr>
+      <w:pPr>
+        <w:pBdr/>
+        <w:spacing/>
+        <w:ind/>
+      </w:pPr>
+      <w:tblPr>
+        <w:tblBorders/>
+      </w:tblPr>
+      <w:tcPr>
+        <w:shd w:val="clear" w:color="ffffff"/>
+        <w:tcBorders>
+          <w:top w:val="none" w:color="000000" w:sz="4" w:space="0"/>
+          <w:left w:val="none" w:color="000000" w:sz="4" w:space="0"/>
+          <w:bottom w:val="none" w:color="000000" w:sz="4" w:space="0"/>
+          <w:right w:val="none" w:color="000000" w:sz="4" w:space="0"/>
+        </w:tcBorders>
+      </w:tcPr>
+    </w:tblStylePr>
+    <w:tblStylePr w:type="lastRow">
+      <w:rPr>
+        <w:b/>
+        <w:color w:val="404040"/>
+      </w:rPr>
+      <w:pPr>
+        <w:pBdr/>
+        <w:spacing/>
+        <w:ind/>
+      </w:pPr>
+      <w:tblPr>
+        <w:tblBorders/>
+      </w:tblPr>
+      <w:tcPr>
+        <w:shd w:val="clear" w:color="ffffff"/>
+        <w:tcBorders>
+          <w:top w:val="none" w:color="000000" w:sz="4" w:space="0"/>
+          <w:left w:val="none" w:color="000000" w:sz="4" w:space="0"/>
+          <w:bottom w:val="none" w:color="000000" w:sz="4" w:space="0"/>
+          <w:right w:val="none" w:color="000000" w:sz="4" w:space="0"/>
+        </w:tcBorders>
+      </w:tcPr>
+    </w:tblStylePr>
     <w:tblStylePr w:type="nwCell">
       <w:pPr>
         <w:pBdr/>
@@ -6796,9 +7160,9 @@
       </w:tcPr>
     </w:tblStylePr>
   </w:style>
-  <w:style w:type="table" w:styleId="38">
+  <w:style w:type="table" w:styleId="727">
     <w:name w:val="Grid Table 3 - Accent 5"/>
-    <w:basedOn w:val="665"/>
+    <w:basedOn w:val="887"/>
     <w:uiPriority w:val="99"/>
     <w:pPr>
       <w:pBdr/>
@@ -6897,29 +7261,6 @@
         <w:tblBorders/>
       </w:tblPr>
       <w:tcPr>
-        <w:shd w:color="ffffff"/>
-        <w:tcBorders>
-          <w:top w:val="none" w:color="000000" w:sz="4" w:space="0"/>
-          <w:left w:val="none" w:color="000000" w:sz="4" w:space="0"/>
-          <w:bottom w:val="none" w:color="000000" w:sz="4" w:space="0"/>
-          <w:right w:val="none" w:color="000000" w:sz="4" w:space="0"/>
-        </w:tcBorders>
-      </w:tcPr>
-    </w:tblStylePr>
-    <w:tblStylePr w:type="firstRow">
-      <w:rPr>
-        <w:b/>
-        <w:color w:val="404040"/>
-      </w:rPr>
-      <w:pPr>
-        <w:pBdr/>
-        <w:spacing/>
-        <w:ind/>
-      </w:pPr>
-      <w:tblPr>
-        <w:tblBorders/>
-      </w:tblPr>
-      <w:tcPr>
         <w:shd w:val="clear" w:color="ffffff"/>
         <w:tcBorders>
           <w:top w:val="none" w:color="000000" w:sz="4" w:space="0"/>
@@ -6929,30 +7270,7 @@
         </w:tcBorders>
       </w:tcPr>
     </w:tblStylePr>
-    <w:tblStylePr w:type="lastCol">
-      <w:rPr>
-        <w:i/>
-        <w:color w:val="404040"/>
-      </w:rPr>
-      <w:pPr>
-        <w:pBdr/>
-        <w:spacing/>
-        <w:ind/>
-      </w:pPr>
-      <w:tblPr>
-        <w:tblBorders/>
-      </w:tblPr>
-      <w:tcPr>
-        <w:shd w:color="ffffff"/>
-        <w:tcBorders>
-          <w:top w:val="none" w:color="000000" w:sz="4" w:space="0"/>
-          <w:left w:val="none" w:color="000000" w:sz="4" w:space="0"/>
-          <w:bottom w:val="none" w:color="000000" w:sz="4" w:space="0"/>
-          <w:right w:val="none" w:color="000000" w:sz="4" w:space="0"/>
-        </w:tcBorders>
-      </w:tcPr>
-    </w:tblStylePr>
-    <w:tblStylePr w:type="lastRow">
+    <w:tblStylePr w:type="firstRow">
       <w:rPr>
         <w:b/>
         <w:color w:val="404040"/>
@@ -6975,6 +7293,52 @@
         </w:tcBorders>
       </w:tcPr>
     </w:tblStylePr>
+    <w:tblStylePr w:type="lastCol">
+      <w:rPr>
+        <w:i/>
+        <w:color w:val="404040"/>
+      </w:rPr>
+      <w:pPr>
+        <w:pBdr/>
+        <w:spacing/>
+        <w:ind/>
+      </w:pPr>
+      <w:tblPr>
+        <w:tblBorders/>
+      </w:tblPr>
+      <w:tcPr>
+        <w:shd w:val="clear" w:color="ffffff"/>
+        <w:tcBorders>
+          <w:top w:val="none" w:color="000000" w:sz="4" w:space="0"/>
+          <w:left w:val="none" w:color="000000" w:sz="4" w:space="0"/>
+          <w:bottom w:val="none" w:color="000000" w:sz="4" w:space="0"/>
+          <w:right w:val="none" w:color="000000" w:sz="4" w:space="0"/>
+        </w:tcBorders>
+      </w:tcPr>
+    </w:tblStylePr>
+    <w:tblStylePr w:type="lastRow">
+      <w:rPr>
+        <w:b/>
+        <w:color w:val="404040"/>
+      </w:rPr>
+      <w:pPr>
+        <w:pBdr/>
+        <w:spacing/>
+        <w:ind/>
+      </w:pPr>
+      <w:tblPr>
+        <w:tblBorders/>
+      </w:tblPr>
+      <w:tcPr>
+        <w:shd w:val="clear" w:color="ffffff"/>
+        <w:tcBorders>
+          <w:top w:val="none" w:color="000000" w:sz="4" w:space="0"/>
+          <w:left w:val="none" w:color="000000" w:sz="4" w:space="0"/>
+          <w:bottom w:val="none" w:color="000000" w:sz="4" w:space="0"/>
+          <w:right w:val="none" w:color="000000" w:sz="4" w:space="0"/>
+        </w:tcBorders>
+      </w:tcPr>
+    </w:tblStylePr>
     <w:tblStylePr w:type="nwCell">
       <w:pPr>
         <w:pBdr/>
@@ -7041,9 +7405,9 @@
       </w:tcPr>
     </w:tblStylePr>
   </w:style>
-  <w:style w:type="table" w:styleId="39">
+  <w:style w:type="table" w:styleId="728">
     <w:name w:val="Grid Table 3 - Accent 6"/>
-    <w:basedOn w:val="665"/>
+    <w:basedOn w:val="887"/>
     <w:uiPriority w:val="99"/>
     <w:pPr>
       <w:pBdr/>
@@ -7142,29 +7506,6 @@
         <w:tblBorders/>
       </w:tblPr>
       <w:tcPr>
-        <w:shd w:color="ffffff"/>
-        <w:tcBorders>
-          <w:top w:val="none" w:color="000000" w:sz="4" w:space="0"/>
-          <w:left w:val="none" w:color="000000" w:sz="4" w:space="0"/>
-          <w:bottom w:val="none" w:color="000000" w:sz="4" w:space="0"/>
-          <w:right w:val="none" w:color="000000" w:sz="4" w:space="0"/>
-        </w:tcBorders>
-      </w:tcPr>
-    </w:tblStylePr>
-    <w:tblStylePr w:type="firstRow">
-      <w:rPr>
-        <w:b/>
-        <w:color w:val="404040"/>
-      </w:rPr>
-      <w:pPr>
-        <w:pBdr/>
-        <w:spacing/>
-        <w:ind/>
-      </w:pPr>
-      <w:tblPr>
-        <w:tblBorders/>
-      </w:tblPr>
-      <w:tcPr>
         <w:shd w:val="clear" w:color="ffffff"/>
         <w:tcBorders>
           <w:top w:val="none" w:color="000000" w:sz="4" w:space="0"/>
@@ -7174,30 +7515,7 @@
         </w:tcBorders>
       </w:tcPr>
     </w:tblStylePr>
-    <w:tblStylePr w:type="lastCol">
-      <w:rPr>
-        <w:i/>
-        <w:color w:val="404040"/>
-      </w:rPr>
-      <w:pPr>
-        <w:pBdr/>
-        <w:spacing/>
-        <w:ind/>
-      </w:pPr>
-      <w:tblPr>
-        <w:tblBorders/>
-      </w:tblPr>
-      <w:tcPr>
-        <w:shd w:color="ffffff"/>
-        <w:tcBorders>
-          <w:top w:val="none" w:color="000000" w:sz="4" w:space="0"/>
-          <w:left w:val="none" w:color="000000" w:sz="4" w:space="0"/>
-          <w:bottom w:val="none" w:color="000000" w:sz="4" w:space="0"/>
-          <w:right w:val="none" w:color="000000" w:sz="4" w:space="0"/>
-        </w:tcBorders>
-      </w:tcPr>
-    </w:tblStylePr>
-    <w:tblStylePr w:type="lastRow">
+    <w:tblStylePr w:type="firstRow">
       <w:rPr>
         <w:b/>
         <w:color w:val="404040"/>
@@ -7220,6 +7538,52 @@
         </w:tcBorders>
       </w:tcPr>
     </w:tblStylePr>
+    <w:tblStylePr w:type="lastCol">
+      <w:rPr>
+        <w:i/>
+        <w:color w:val="404040"/>
+      </w:rPr>
+      <w:pPr>
+        <w:pBdr/>
+        <w:spacing/>
+        <w:ind/>
+      </w:pPr>
+      <w:tblPr>
+        <w:tblBorders/>
+      </w:tblPr>
+      <w:tcPr>
+        <w:shd w:val="clear" w:color="ffffff"/>
+        <w:tcBorders>
+          <w:top w:val="none" w:color="000000" w:sz="4" w:space="0"/>
+          <w:left w:val="none" w:color="000000" w:sz="4" w:space="0"/>
+          <w:bottom w:val="none" w:color="000000" w:sz="4" w:space="0"/>
+          <w:right w:val="none" w:color="000000" w:sz="4" w:space="0"/>
+        </w:tcBorders>
+      </w:tcPr>
+    </w:tblStylePr>
+    <w:tblStylePr w:type="lastRow">
+      <w:rPr>
+        <w:b/>
+        <w:color w:val="404040"/>
+      </w:rPr>
+      <w:pPr>
+        <w:pBdr/>
+        <w:spacing/>
+        <w:ind/>
+      </w:pPr>
+      <w:tblPr>
+        <w:tblBorders/>
+      </w:tblPr>
+      <w:tcPr>
+        <w:shd w:val="clear" w:color="ffffff"/>
+        <w:tcBorders>
+          <w:top w:val="none" w:color="000000" w:sz="4" w:space="0"/>
+          <w:left w:val="none" w:color="000000" w:sz="4" w:space="0"/>
+          <w:bottom w:val="none" w:color="000000" w:sz="4" w:space="0"/>
+          <w:right w:val="none" w:color="000000" w:sz="4" w:space="0"/>
+        </w:tcBorders>
+      </w:tcPr>
+    </w:tblStylePr>
     <w:tblStylePr w:type="nwCell">
       <w:pPr>
         <w:pBdr/>
@@ -7286,9 +7650,9 @@
       </w:tcPr>
     </w:tblStylePr>
   </w:style>
-  <w:style w:type="table" w:styleId="40">
+  <w:style w:type="table" w:styleId="729">
     <w:name w:val="Grid Table 4"/>
-    <w:basedOn w:val="665"/>
+    <w:basedOn w:val="887"/>
     <w:uiPriority w:val="59"/>
     <w:pPr>
       <w:pBdr/>
@@ -7519,9 +7883,9 @@
       </w:tcPr>
     </w:tblStylePr>
   </w:style>
-  <w:style w:type="table" w:styleId="41">
+  <w:style w:type="table" w:styleId="730">
     <w:name w:val="Grid Table 4 - Accent 1"/>
-    <w:basedOn w:val="665"/>
+    <w:basedOn w:val="887"/>
     <w:uiPriority w:val="59"/>
     <w:pPr>
       <w:pBdr/>
@@ -7752,9 +8116,9 @@
       </w:tcPr>
     </w:tblStylePr>
   </w:style>
-  <w:style w:type="table" w:styleId="42">
+  <w:style w:type="table" w:styleId="731">
     <w:name w:val="Grid Table 4 - Accent 2"/>
-    <w:basedOn w:val="665"/>
+    <w:basedOn w:val="887"/>
     <w:uiPriority w:val="59"/>
     <w:pPr>
       <w:pBdr/>
@@ -7985,9 +8349,9 @@
       </w:tcPr>
     </w:tblStylePr>
   </w:style>
-  <w:style w:type="table" w:styleId="43">
+  <w:style w:type="table" w:styleId="732">
     <w:name w:val="Grid Table 4 - Accent 3"/>
-    <w:basedOn w:val="665"/>
+    <w:basedOn w:val="887"/>
     <w:uiPriority w:val="59"/>
     <w:pPr>
       <w:pBdr/>
@@ -8218,9 +8582,9 @@
       </w:tcPr>
     </w:tblStylePr>
   </w:style>
-  <w:style w:type="table" w:styleId="44">
+  <w:style w:type="table" w:styleId="733">
     <w:name w:val="Grid Table 4 - Accent 4"/>
-    <w:basedOn w:val="665"/>
+    <w:basedOn w:val="887"/>
     <w:uiPriority w:val="59"/>
     <w:pPr>
       <w:pBdr/>
@@ -8451,9 +8815,9 @@
       </w:tcPr>
     </w:tblStylePr>
   </w:style>
-  <w:style w:type="table" w:styleId="45">
+  <w:style w:type="table" w:styleId="734">
     <w:name w:val="Grid Table 4 - Accent 5"/>
-    <w:basedOn w:val="665"/>
+    <w:basedOn w:val="887"/>
     <w:uiPriority w:val="59"/>
     <w:pPr>
       <w:pBdr/>
@@ -8684,9 +9048,9 @@
       </w:tcPr>
     </w:tblStylePr>
   </w:style>
-  <w:style w:type="table" w:styleId="46">
+  <w:style w:type="table" w:styleId="735">
     <w:name w:val="Grid Table 4 - Accent 6"/>
-    <w:basedOn w:val="665"/>
+    <w:basedOn w:val="887"/>
     <w:uiPriority w:val="59"/>
     <w:pPr>
       <w:pBdr/>
@@ -8917,9 +9281,9 @@
       </w:tcPr>
     </w:tblStylePr>
   </w:style>
-  <w:style w:type="table" w:styleId="47">
+  <w:style w:type="table" w:styleId="736">
     <w:name w:val="Grid Table 5 Dark"/>
-    <w:basedOn w:val="665"/>
+    <w:basedOn w:val="887"/>
     <w:uiPriority w:val="99"/>
     <w:pPr>
       <w:pBdr/>
@@ -9145,9 +9509,9 @@
       </w:tcPr>
     </w:tblStylePr>
   </w:style>
-  <w:style w:type="table" w:styleId="48">
+  <w:style w:type="table" w:styleId="737">
     <w:name w:val="Grid Table 5 Dark- Accent 1"/>
-    <w:basedOn w:val="665"/>
+    <w:basedOn w:val="887"/>
     <w:uiPriority w:val="99"/>
     <w:pPr>
       <w:pBdr/>
@@ -9373,9 +9737,9 @@
       </w:tcPr>
     </w:tblStylePr>
   </w:style>
-  <w:style w:type="table" w:styleId="49">
+  <w:style w:type="table" w:styleId="738">
     <w:name w:val="Grid Table 5 Dark - Accent 2"/>
-    <w:basedOn w:val="665"/>
+    <w:basedOn w:val="887"/>
     <w:uiPriority w:val="99"/>
     <w:pPr>
       <w:pBdr/>
@@ -9601,9 +9965,9 @@
       </w:tcPr>
     </w:tblStylePr>
   </w:style>
-  <w:style w:type="table" w:styleId="50">
+  <w:style w:type="table" w:styleId="739">
     <w:name w:val="Grid Table 5 Dark - Accent 3"/>
-    <w:basedOn w:val="665"/>
+    <w:basedOn w:val="887"/>
     <w:uiPriority w:val="99"/>
     <w:pPr>
       <w:pBdr/>
@@ -9829,9 +10193,9 @@
       </w:tcPr>
     </w:tblStylePr>
   </w:style>
-  <w:style w:type="table" w:styleId="51">
+  <w:style w:type="table" w:styleId="740">
     <w:name w:val="Grid Table 5 Dark- Accent 4"/>
-    <w:basedOn w:val="665"/>
+    <w:basedOn w:val="887"/>
     <w:uiPriority w:val="99"/>
     <w:pPr>
       <w:pBdr/>
@@ -10057,9 +10421,9 @@
       </w:tcPr>
     </w:tblStylePr>
   </w:style>
-  <w:style w:type="table" w:styleId="52">
+  <w:style w:type="table" w:styleId="741">
     <w:name w:val="Grid Table 5 Dark - Accent 5"/>
-    <w:basedOn w:val="665"/>
+    <w:basedOn w:val="887"/>
     <w:uiPriority w:val="99"/>
     <w:pPr>
       <w:pBdr/>
@@ -10285,9 +10649,9 @@
       </w:tcPr>
     </w:tblStylePr>
   </w:style>
-  <w:style w:type="table" w:styleId="53">
+  <w:style w:type="table" w:styleId="742">
     <w:name w:val="Grid Table 5 Dark - Accent 6"/>
-    <w:basedOn w:val="665"/>
+    <w:basedOn w:val="887"/>
     <w:uiPriority w:val="99"/>
     <w:pPr>
       <w:pBdr/>
@@ -10513,9 +10877,9 @@
       </w:tcPr>
     </w:tblStylePr>
   </w:style>
-  <w:style w:type="table" w:styleId="54">
+  <w:style w:type="table" w:styleId="743">
     <w:name w:val="Grid Table 6 Colorful"/>
-    <w:basedOn w:val="665"/>
+    <w:basedOn w:val="887"/>
     <w:uiPriority w:val="99"/>
     <w:pPr>
       <w:pBdr/>
@@ -10743,9 +11107,9 @@
       </w:tcPr>
     </w:tblStylePr>
   </w:style>
-  <w:style w:type="table" w:styleId="55">
+  <w:style w:type="table" w:styleId="744">
     <w:name w:val="Grid Table 6 Colorful - Accent 1"/>
-    <w:basedOn w:val="665"/>
+    <w:basedOn w:val="887"/>
     <w:uiPriority w:val="99"/>
     <w:pPr>
       <w:pBdr/>
@@ -10973,9 +11337,9 @@
       </w:tcPr>
     </w:tblStylePr>
   </w:style>
-  <w:style w:type="table" w:styleId="56">
+  <w:style w:type="table" w:styleId="745">
     <w:name w:val="Grid Table 6 Colorful - Accent 2"/>
-    <w:basedOn w:val="665"/>
+    <w:basedOn w:val="887"/>
     <w:uiPriority w:val="99"/>
     <w:pPr>
       <w:pBdr/>
@@ -11203,9 +11567,9 @@
       </w:tcPr>
     </w:tblStylePr>
   </w:style>
-  <w:style w:type="table" w:styleId="57">
+  <w:style w:type="table" w:styleId="746">
     <w:name w:val="Grid Table 6 Colorful - Accent 3"/>
-    <w:basedOn w:val="665"/>
+    <w:basedOn w:val="887"/>
     <w:uiPriority w:val="99"/>
     <w:pPr>
       <w:pBdr/>
@@ -11433,9 +11797,9 @@
       </w:tcPr>
     </w:tblStylePr>
   </w:style>
-  <w:style w:type="table" w:styleId="58">
+  <w:style w:type="table" w:styleId="747">
     <w:name w:val="Grid Table 6 Colorful - Accent 4"/>
-    <w:basedOn w:val="665"/>
+    <w:basedOn w:val="887"/>
     <w:uiPriority w:val="99"/>
     <w:pPr>
       <w:pBdr/>
@@ -11663,9 +12027,9 @@
       </w:tcPr>
     </w:tblStylePr>
   </w:style>
-  <w:style w:type="table" w:styleId="59">
+  <w:style w:type="table" w:styleId="748">
     <w:name w:val="Grid Table 6 Colorful - Accent 5"/>
-    <w:basedOn w:val="665"/>
+    <w:basedOn w:val="887"/>
     <w:uiPriority w:val="99"/>
     <w:pPr>
       <w:pBdr/>
@@ -11893,9 +12257,9 @@
       </w:tcPr>
     </w:tblStylePr>
   </w:style>
-  <w:style w:type="table" w:styleId="60">
+  <w:style w:type="table" w:styleId="749">
     <w:name w:val="Grid Table 6 Colorful - Accent 6"/>
-    <w:basedOn w:val="665"/>
+    <w:basedOn w:val="887"/>
     <w:uiPriority w:val="99"/>
     <w:pPr>
       <w:pBdr/>
@@ -12123,9 +12487,9 @@
       </w:tcPr>
     </w:tblStylePr>
   </w:style>
-  <w:style w:type="table" w:styleId="61">
+  <w:style w:type="table" w:styleId="750">
     <w:name w:val="Grid Table 7 Colorful"/>
-    <w:basedOn w:val="665"/>
+    <w:basedOn w:val="887"/>
     <w:uiPriority w:val="99"/>
     <w:pPr>
       <w:pBdr/>
@@ -12227,11 +12591,11 @@
         <w:tblBorders/>
       </w:tblPr>
       <w:tcPr>
-        <w:shd w:color="ffffff"/>
+        <w:shd w:val="clear" w:color="ffffff"/>
         <w:tcBorders>
-          <w:top w:val="none"/>
-          <w:left w:val="none"/>
-          <w:bottom w:val="none"/>
+          <w:top w:val="none" w:color="000000" w:sz="4" w:space="0"/>
+          <w:left w:val="none" w:color="000000" w:sz="4" w:space="0"/>
+          <w:bottom w:val="none" w:color="000000" w:sz="4" w:space="0"/>
           <w:right w:val="single" w:color="000000" w:themeColor="text1" w:themeTint="80" w:sz="4" w:space="0"/>
         </w:tcBorders>
       </w:tcPr>
@@ -12254,10 +12618,10 @@
       <w:tcPr>
         <w:shd w:val="clear" w:color="ffffff" w:themeColor="light1" w:fill="ffffff" w:themeFill="light1"/>
         <w:tcBorders>
-          <w:top w:val="none"/>
-          <w:left w:val="none"/>
+          <w:top w:val="none" w:color="000000" w:sz="4" w:space="0"/>
+          <w:left w:val="none" w:color="000000" w:sz="4" w:space="0"/>
           <w:bottom w:val="single" w:color="000000" w:themeColor="text1" w:themeTint="80" w:sz="4" w:space="0"/>
-          <w:right w:val="none"/>
+          <w:right w:val="none" w:color="000000" w:sz="4" w:space="0"/>
         </w:tcBorders>
       </w:tcPr>
     </w:tblStylePr>
@@ -12277,12 +12641,12 @@
         <w:tblBorders/>
       </w:tblPr>
       <w:tcPr>
-        <w:shd w:color="ffffff"/>
+        <w:shd w:val="clear" w:color="ffffff"/>
         <w:tcBorders>
-          <w:top w:val="none"/>
+          <w:top w:val="none" w:color="000000" w:sz="4" w:space="0"/>
           <w:left w:val="single" w:color="000000" w:themeColor="text1" w:themeTint="80" w:sz="4" w:space="0"/>
-          <w:bottom w:val="none"/>
-          <w:right w:val="none"/>
+          <w:bottom w:val="none" w:color="000000" w:sz="4" w:space="0"/>
+          <w:right w:val="none" w:color="000000" w:sz="4" w:space="0"/>
         </w:tcBorders>
       </w:tcPr>
     </w:tblStylePr>
@@ -12305,9 +12669,9 @@
         <w:shd w:val="clear" w:color="ffffff" w:themeColor="light1" w:fill="ffffff" w:themeFill="light1"/>
         <w:tcBorders>
           <w:top w:val="single" w:color="000000" w:themeColor="text1" w:themeTint="80" w:sz="4" w:space="0"/>
-          <w:left w:val="none"/>
-          <w:bottom w:val="none"/>
-          <w:right w:val="none"/>
+          <w:left w:val="none" w:color="000000" w:sz="4" w:space="0"/>
+          <w:bottom w:val="none" w:color="000000" w:sz="4" w:space="0"/>
+          <w:right w:val="none" w:color="000000" w:sz="4" w:space="0"/>
         </w:tcBorders>
       </w:tcPr>
     </w:tblStylePr>
@@ -12377,9 +12741,9 @@
       </w:tcPr>
     </w:tblStylePr>
   </w:style>
-  <w:style w:type="table" w:styleId="62">
+  <w:style w:type="table" w:styleId="751">
     <w:name w:val="Grid Table 7 Colorful - Accent 1"/>
-    <w:basedOn w:val="665"/>
+    <w:basedOn w:val="887"/>
     <w:uiPriority w:val="99"/>
     <w:pPr>
       <w:pBdr/>
@@ -12481,11 +12845,11 @@
         <w:tblBorders/>
       </w:tblPr>
       <w:tcPr>
-        <w:shd w:color="ffffff"/>
+        <w:shd w:val="clear" w:color="ffffff"/>
         <w:tcBorders>
-          <w:top w:val="none"/>
-          <w:left w:val="none"/>
-          <w:bottom w:val="none"/>
+          <w:top w:val="none" w:color="000000" w:sz="4" w:space="0"/>
+          <w:left w:val="none" w:color="000000" w:sz="4" w:space="0"/>
+          <w:bottom w:val="none" w:color="000000" w:sz="4" w:space="0"/>
           <w:right w:val="single" w:color="000000" w:themeColor="accent1" w:themeTint="80" w:sz="4" w:space="0"/>
         </w:tcBorders>
       </w:tcPr>
@@ -12508,10 +12872,10 @@
       <w:tcPr>
         <w:shd w:val="clear" w:color="ffffff" w:themeColor="light1" w:fill="ffffff" w:themeFill="light1"/>
         <w:tcBorders>
-          <w:top w:val="none"/>
-          <w:left w:val="none"/>
+          <w:top w:val="none" w:color="000000" w:sz="4" w:space="0"/>
+          <w:left w:val="none" w:color="000000" w:sz="4" w:space="0"/>
           <w:bottom w:val="single" w:color="000000" w:themeColor="accent1" w:themeTint="80" w:sz="4" w:space="0"/>
-          <w:right w:val="none"/>
+          <w:right w:val="none" w:color="000000" w:sz="4" w:space="0"/>
         </w:tcBorders>
       </w:tcPr>
     </w:tblStylePr>
@@ -12531,12 +12895,12 @@
         <w:tblBorders/>
       </w:tblPr>
       <w:tcPr>
-        <w:shd w:color="ffffff"/>
+        <w:shd w:val="clear" w:color="ffffff"/>
         <w:tcBorders>
-          <w:top w:val="none"/>
+          <w:top w:val="none" w:color="000000" w:sz="4" w:space="0"/>
           <w:left w:val="single" w:color="000000" w:themeColor="accent1" w:themeTint="80" w:sz="4" w:space="0"/>
-          <w:bottom w:val="none"/>
-          <w:right w:val="none"/>
+          <w:bottom w:val="none" w:color="000000" w:sz="4" w:space="0"/>
+          <w:right w:val="none" w:color="000000" w:sz="4" w:space="0"/>
         </w:tcBorders>
       </w:tcPr>
     </w:tblStylePr>
@@ -12559,9 +12923,9 @@
         <w:shd w:val="clear" w:color="ffffff" w:themeColor="light1" w:fill="ffffff" w:themeFill="light1"/>
         <w:tcBorders>
           <w:top w:val="single" w:color="000000" w:themeColor="accent1" w:themeTint="80" w:sz="4" w:space="0"/>
-          <w:left w:val="none"/>
-          <w:bottom w:val="none"/>
-          <w:right w:val="none"/>
+          <w:left w:val="none" w:color="000000" w:sz="4" w:space="0"/>
+          <w:bottom w:val="none" w:color="000000" w:sz="4" w:space="0"/>
+          <w:right w:val="none" w:color="000000" w:sz="4" w:space="0"/>
         </w:tcBorders>
       </w:tcPr>
     </w:tblStylePr>
@@ -12631,9 +12995,9 @@
       </w:tcPr>
     </w:tblStylePr>
   </w:style>
-  <w:style w:type="table" w:styleId="63">
+  <w:style w:type="table" w:styleId="752">
     <w:name w:val="Grid Table 7 Colorful - Accent 2"/>
-    <w:basedOn w:val="665"/>
+    <w:basedOn w:val="887"/>
     <w:uiPriority w:val="99"/>
     <w:pPr>
       <w:pBdr/>
@@ -12735,11 +13099,11 @@
         <w:tblBorders/>
       </w:tblPr>
       <w:tcPr>
-        <w:shd w:color="ffffff"/>
+        <w:shd w:val="clear" w:color="ffffff"/>
         <w:tcBorders>
-          <w:top w:val="none"/>
-          <w:left w:val="none"/>
-          <w:bottom w:val="none"/>
+          <w:top w:val="none" w:color="000000" w:sz="4" w:space="0"/>
+          <w:left w:val="none" w:color="000000" w:sz="4" w:space="0"/>
+          <w:bottom w:val="none" w:color="000000" w:sz="4" w:space="0"/>
           <w:right w:val="single" w:color="000000" w:themeColor="accent2" w:themeTint="97" w:sz="4" w:space="0"/>
         </w:tcBorders>
       </w:tcPr>
@@ -12762,10 +13126,10 @@
       <w:tcPr>
         <w:shd w:val="clear" w:color="ffffff" w:themeColor="light1" w:fill="ffffff" w:themeFill="light1"/>
         <w:tcBorders>
-          <w:top w:val="none"/>
-          <w:left w:val="none"/>
+          <w:top w:val="none" w:color="000000" w:sz="4" w:space="0"/>
+          <w:left w:val="none" w:color="000000" w:sz="4" w:space="0"/>
           <w:bottom w:val="single" w:color="000000" w:themeColor="accent2" w:themeTint="97" w:sz="4" w:space="0"/>
-          <w:right w:val="none"/>
+          <w:right w:val="none" w:color="000000" w:sz="4" w:space="0"/>
         </w:tcBorders>
       </w:tcPr>
     </w:tblStylePr>
@@ -12785,12 +13149,12 @@
         <w:tblBorders/>
       </w:tblPr>
       <w:tcPr>
-        <w:shd w:color="ffffff"/>
+        <w:shd w:val="clear" w:color="ffffff"/>
         <w:tcBorders>
-          <w:top w:val="none"/>
+          <w:top w:val="none" w:color="000000" w:sz="4" w:space="0"/>
           <w:left w:val="single" w:color="000000" w:themeColor="accent2" w:themeTint="97" w:sz="4" w:space="0"/>
-          <w:bottom w:val="none"/>
-          <w:right w:val="none"/>
+          <w:bottom w:val="none" w:color="000000" w:sz="4" w:space="0"/>
+          <w:right w:val="none" w:color="000000" w:sz="4" w:space="0"/>
         </w:tcBorders>
       </w:tcPr>
     </w:tblStylePr>
@@ -12813,9 +13177,9 @@
         <w:shd w:val="clear" w:color="ffffff" w:themeColor="light1" w:fill="ffffff" w:themeFill="light1"/>
         <w:tcBorders>
           <w:top w:val="single" w:color="000000" w:themeColor="accent2" w:themeTint="97" w:sz="4" w:space="0"/>
-          <w:left w:val="none"/>
-          <w:bottom w:val="none"/>
-          <w:right w:val="none"/>
+          <w:left w:val="none" w:color="000000" w:sz="4" w:space="0"/>
+          <w:bottom w:val="none" w:color="000000" w:sz="4" w:space="0"/>
+          <w:right w:val="none" w:color="000000" w:sz="4" w:space="0"/>
         </w:tcBorders>
       </w:tcPr>
     </w:tblStylePr>
@@ -12885,9 +13249,9 @@
       </w:tcPr>
     </w:tblStylePr>
   </w:style>
-  <w:style w:type="table" w:styleId="64">
+  <w:style w:type="table" w:styleId="753">
     <w:name w:val="Grid Table 7 Colorful - Accent 3"/>
-    <w:basedOn w:val="665"/>
+    <w:basedOn w:val="887"/>
     <w:uiPriority w:val="99"/>
     <w:pPr>
       <w:pBdr/>
@@ -12989,11 +13353,11 @@
         <w:tblBorders/>
       </w:tblPr>
       <w:tcPr>
-        <w:shd w:color="ffffff"/>
+        <w:shd w:val="clear" w:color="ffffff"/>
         <w:tcBorders>
-          <w:top w:val="none"/>
-          <w:left w:val="none"/>
-          <w:bottom w:val="none"/>
+          <w:top w:val="none" w:color="000000" w:sz="4" w:space="0"/>
+          <w:left w:val="none" w:color="000000" w:sz="4" w:space="0"/>
+          <w:bottom w:val="none" w:color="000000" w:sz="4" w:space="0"/>
           <w:right w:val="single" w:color="000000" w:themeColor="accent3" w:themeTint="FE" w:sz="4" w:space="0"/>
         </w:tcBorders>
       </w:tcPr>
@@ -13016,10 +13380,10 @@
       <w:tcPr>
         <w:shd w:val="clear" w:color="ffffff" w:themeColor="light1" w:fill="ffffff" w:themeFill="light1"/>
         <w:tcBorders>
-          <w:top w:val="none"/>
-          <w:left w:val="none"/>
+          <w:top w:val="none" w:color="000000" w:sz="4" w:space="0"/>
+          <w:left w:val="none" w:color="000000" w:sz="4" w:space="0"/>
           <w:bottom w:val="single" w:color="000000" w:themeColor="accent3" w:themeTint="FE" w:sz="4" w:space="0"/>
-          <w:right w:val="none"/>
+          <w:right w:val="none" w:color="000000" w:sz="4" w:space="0"/>
         </w:tcBorders>
       </w:tcPr>
     </w:tblStylePr>
@@ -13039,12 +13403,12 @@
         <w:tblBorders/>
       </w:tblPr>
       <w:tcPr>
-        <w:shd w:color="ffffff"/>
+        <w:shd w:val="clear" w:color="ffffff"/>
         <w:tcBorders>
-          <w:top w:val="none"/>
+          <w:top w:val="none" w:color="000000" w:sz="4" w:space="0"/>
           <w:left w:val="single" w:color="000000" w:themeColor="accent3" w:themeTint="FE" w:sz="4" w:space="0"/>
-          <w:bottom w:val="none"/>
-          <w:right w:val="none"/>
+          <w:bottom w:val="none" w:color="000000" w:sz="4" w:space="0"/>
+          <w:right w:val="none" w:color="000000" w:sz="4" w:space="0"/>
         </w:tcBorders>
       </w:tcPr>
     </w:tblStylePr>
@@ -13067,9 +13431,9 @@
         <w:shd w:val="clear" w:color="ffffff" w:themeColor="light1" w:fill="ffffff" w:themeFill="light1"/>
         <w:tcBorders>
           <w:top w:val="single" w:color="000000" w:themeColor="accent3" w:themeTint="FE" w:sz="4" w:space="0"/>
-          <w:left w:val="none"/>
-          <w:bottom w:val="none"/>
-          <w:right w:val="none"/>
+          <w:left w:val="none" w:color="000000" w:sz="4" w:space="0"/>
+          <w:bottom w:val="none" w:color="000000" w:sz="4" w:space="0"/>
+          <w:right w:val="none" w:color="000000" w:sz="4" w:space="0"/>
         </w:tcBorders>
       </w:tcPr>
     </w:tblStylePr>
@@ -13139,9 +13503,9 @@
       </w:tcPr>
     </w:tblStylePr>
   </w:style>
-  <w:style w:type="table" w:styleId="65">
+  <w:style w:type="table" w:styleId="754">
     <w:name w:val="Grid Table 7 Colorful - Accent 4"/>
-    <w:basedOn w:val="665"/>
+    <w:basedOn w:val="887"/>
     <w:uiPriority w:val="99"/>
     <w:pPr>
       <w:pBdr/>
@@ -13243,11 +13607,11 @@
         <w:tblBorders/>
       </w:tblPr>
       <w:tcPr>
-        <w:shd w:color="ffffff"/>
+        <w:shd w:val="clear" w:color="ffffff"/>
         <w:tcBorders>
-          <w:top w:val="none"/>
-          <w:left w:val="none"/>
-          <w:bottom w:val="none"/>
+          <w:top w:val="none" w:color="000000" w:sz="4" w:space="0"/>
+          <w:left w:val="none" w:color="000000" w:sz="4" w:space="0"/>
+          <w:bottom w:val="none" w:color="000000" w:sz="4" w:space="0"/>
           <w:right w:val="single" w:color="000000" w:themeColor="accent4" w:themeTint="9A" w:sz="4" w:space="0"/>
         </w:tcBorders>
       </w:tcPr>
@@ -13270,10 +13634,10 @@
       <w:tcPr>
         <w:shd w:val="clear" w:color="ffffff" w:themeColor="light1" w:fill="ffffff" w:themeFill="light1"/>
         <w:tcBorders>
-          <w:top w:val="none"/>
-          <w:left w:val="none"/>
+          <w:top w:val="none" w:color="000000" w:sz="4" w:space="0"/>
+          <w:left w:val="none" w:color="000000" w:sz="4" w:space="0"/>
           <w:bottom w:val="single" w:color="000000" w:themeColor="accent4" w:themeTint="9A" w:sz="4" w:space="0"/>
-          <w:right w:val="none"/>
+          <w:right w:val="none" w:color="000000" w:sz="4" w:space="0"/>
         </w:tcBorders>
       </w:tcPr>
     </w:tblStylePr>
@@ -13293,12 +13657,12 @@
         <w:tblBorders/>
       </w:tblPr>
       <w:tcPr>
-        <w:shd w:color="ffffff"/>
+        <w:shd w:val="clear" w:color="ffffff"/>
         <w:tcBorders>
-          <w:top w:val="none"/>
+          <w:top w:val="none" w:color="000000" w:sz="4" w:space="0"/>
           <w:left w:val="single" w:color="000000" w:themeColor="accent4" w:themeTint="9A" w:sz="4" w:space="0"/>
-          <w:bottom w:val="none"/>
-          <w:right w:val="none"/>
+          <w:bottom w:val="none" w:color="000000" w:sz="4" w:space="0"/>
+          <w:right w:val="none" w:color="000000" w:sz="4" w:space="0"/>
         </w:tcBorders>
       </w:tcPr>
     </w:tblStylePr>
@@ -13321,9 +13685,9 @@
         <w:shd w:val="clear" w:color="ffffff" w:themeColor="light1" w:fill="ffffff" w:themeFill="light1"/>
         <w:tcBorders>
           <w:top w:val="single" w:color="000000" w:themeColor="accent4" w:themeTint="9A" w:sz="4" w:space="0"/>
-          <w:left w:val="none"/>
-          <w:bottom w:val="none"/>
-          <w:right w:val="none"/>
+          <w:left w:val="none" w:color="000000" w:sz="4" w:space="0"/>
+          <w:bottom w:val="none" w:color="000000" w:sz="4" w:space="0"/>
+          <w:right w:val="none" w:color="000000" w:sz="4" w:space="0"/>
         </w:tcBorders>
       </w:tcPr>
     </w:tblStylePr>
@@ -13393,9 +13757,9 @@
       </w:tcPr>
     </w:tblStylePr>
   </w:style>
-  <w:style w:type="table" w:styleId="66">
+  <w:style w:type="table" w:styleId="755">
     <w:name w:val="Grid Table 7 Colorful - Accent 5"/>
-    <w:basedOn w:val="665"/>
+    <w:basedOn w:val="887"/>
     <w:uiPriority w:val="99"/>
     <w:pPr>
       <w:pBdr/>
@@ -13497,11 +13861,11 @@
         <w:tblBorders/>
       </w:tblPr>
       <w:tcPr>
-        <w:shd w:color="ffffff"/>
+        <w:shd w:val="clear" w:color="ffffff"/>
         <w:tcBorders>
-          <w:top w:val="none"/>
-          <w:left w:val="none"/>
-          <w:bottom w:val="none"/>
+          <w:top w:val="none" w:color="000000" w:sz="4" w:space="0"/>
+          <w:left w:val="none" w:color="000000" w:sz="4" w:space="0"/>
+          <w:bottom w:val="none" w:color="000000" w:sz="4" w:space="0"/>
           <w:right w:val="single" w:color="000000" w:themeColor="accent5" w:themeTint="90" w:sz="4" w:space="0"/>
         </w:tcBorders>
       </w:tcPr>
@@ -13524,10 +13888,10 @@
       <w:tcPr>
         <w:shd w:val="clear" w:color="ffffff" w:themeColor="light1" w:fill="ffffff" w:themeFill="light1"/>
         <w:tcBorders>
-          <w:top w:val="none"/>
-          <w:left w:val="none"/>
+          <w:top w:val="none" w:color="000000" w:sz="4" w:space="0"/>
+          <w:left w:val="none" w:color="000000" w:sz="4" w:space="0"/>
           <w:bottom w:val="single" w:color="000000" w:themeColor="accent5" w:themeTint="90" w:sz="4" w:space="0"/>
-          <w:right w:val="none"/>
+          <w:right w:val="none" w:color="000000" w:sz="4" w:space="0"/>
         </w:tcBorders>
       </w:tcPr>
     </w:tblStylePr>
@@ -13547,12 +13911,12 @@
         <w:tblBorders/>
       </w:tblPr>
       <w:tcPr>
-        <w:shd w:color="ffffff"/>
+        <w:shd w:val="clear" w:color="ffffff"/>
         <w:tcBorders>
-          <w:top w:val="none"/>
+          <w:top w:val="none" w:color="000000" w:sz="4" w:space="0"/>
           <w:left w:val="single" w:color="000000" w:themeColor="accent5" w:themeTint="90" w:sz="4" w:space="0"/>
-          <w:bottom w:val="none"/>
-          <w:right w:val="none"/>
+          <w:bottom w:val="none" w:color="000000" w:sz="4" w:space="0"/>
+          <w:right w:val="none" w:color="000000" w:sz="4" w:space="0"/>
         </w:tcBorders>
       </w:tcPr>
     </w:tblStylePr>
@@ -13575,9 +13939,9 @@
         <w:shd w:val="clear" w:color="ffffff" w:themeColor="light1" w:fill="ffffff" w:themeFill="light1"/>
         <w:tcBorders>
           <w:top w:val="single" w:color="000000" w:themeColor="accent5" w:themeTint="90" w:sz="4" w:space="0"/>
-          <w:left w:val="none"/>
-          <w:bottom w:val="none"/>
-          <w:right w:val="none"/>
+          <w:left w:val="none" w:color="000000" w:sz="4" w:space="0"/>
+          <w:bottom w:val="none" w:color="000000" w:sz="4" w:space="0"/>
+          <w:right w:val="none" w:color="000000" w:sz="4" w:space="0"/>
         </w:tcBorders>
       </w:tcPr>
     </w:tblStylePr>
@@ -13647,9 +14011,9 @@
       </w:tcPr>
     </w:tblStylePr>
   </w:style>
-  <w:style w:type="table" w:styleId="67">
+  <w:style w:type="table" w:styleId="756">
     <w:name w:val="Grid Table 7 Colorful - Accent 6"/>
-    <w:basedOn w:val="665"/>
+    <w:basedOn w:val="887"/>
     <w:uiPriority w:val="99"/>
     <w:pPr>
       <w:pBdr/>
@@ -13751,11 +14115,11 @@
         <w:tblBorders/>
       </w:tblPr>
       <w:tcPr>
-        <w:shd w:color="ffffff"/>
+        <w:shd w:val="clear" w:color="ffffff"/>
         <w:tcBorders>
-          <w:top w:val="none"/>
-          <w:left w:val="none"/>
-          <w:bottom w:val="none"/>
+          <w:top w:val="none" w:color="000000" w:sz="4" w:space="0"/>
+          <w:left w:val="none" w:color="000000" w:sz="4" w:space="0"/>
+          <w:bottom w:val="none" w:color="000000" w:sz="4" w:space="0"/>
           <w:right w:val="single" w:color="000000" w:themeColor="accent6" w:themeTint="90" w:sz="4" w:space="0"/>
         </w:tcBorders>
       </w:tcPr>
@@ -13778,10 +14142,10 @@
       <w:tcPr>
         <w:shd w:val="clear" w:color="ffffff" w:themeColor="light1" w:fill="ffffff" w:themeFill="light1"/>
         <w:tcBorders>
-          <w:top w:val="none"/>
-          <w:left w:val="none"/>
+          <w:top w:val="none" w:color="000000" w:sz="4" w:space="0"/>
+          <w:left w:val="none" w:color="000000" w:sz="4" w:space="0"/>
           <w:bottom w:val="single" w:color="000000" w:themeColor="accent6" w:themeTint="90" w:sz="4" w:space="0"/>
-          <w:right w:val="none"/>
+          <w:right w:val="none" w:color="000000" w:sz="4" w:space="0"/>
         </w:tcBorders>
       </w:tcPr>
     </w:tblStylePr>
@@ -13801,12 +14165,12 @@
         <w:tblBorders/>
       </w:tblPr>
       <w:tcPr>
-        <w:shd w:color="ffffff"/>
+        <w:shd w:val="clear" w:color="ffffff"/>
         <w:tcBorders>
-          <w:top w:val="none"/>
+          <w:top w:val="none" w:color="000000" w:sz="4" w:space="0"/>
           <w:left w:val="single" w:color="000000" w:themeColor="accent6" w:themeTint="90" w:sz="4" w:space="0"/>
-          <w:bottom w:val="none"/>
-          <w:right w:val="none"/>
+          <w:bottom w:val="none" w:color="000000" w:sz="4" w:space="0"/>
+          <w:right w:val="none" w:color="000000" w:sz="4" w:space="0"/>
         </w:tcBorders>
       </w:tcPr>
     </w:tblStylePr>
@@ -13829,9 +14193,9 @@
         <w:shd w:val="clear" w:color="ffffff" w:themeColor="light1" w:fill="ffffff" w:themeFill="light1"/>
         <w:tcBorders>
           <w:top w:val="single" w:color="000000" w:themeColor="accent6" w:themeTint="90" w:sz="4" w:space="0"/>
-          <w:left w:val="none"/>
-          <w:bottom w:val="none"/>
-          <w:right w:val="none"/>
+          <w:left w:val="none" w:color="000000" w:sz="4" w:space="0"/>
+          <w:bottom w:val="none" w:color="000000" w:sz="4" w:space="0"/>
+          <w:right w:val="none" w:color="000000" w:sz="4" w:space="0"/>
         </w:tcBorders>
       </w:tcPr>
     </w:tblStylePr>
@@ -13901,9 +14265,9 @@
       </w:tcPr>
     </w:tblStylePr>
   </w:style>
-  <w:style w:type="table" w:styleId="68">
+  <w:style w:type="table" w:styleId="757">
     <w:name w:val="List Table 1 Light"/>
-    <w:basedOn w:val="665"/>
+    <w:basedOn w:val="887"/>
     <w:uiPriority w:val="99"/>
     <w:pPr>
       <w:pBdr/>
@@ -14117,9 +14481,9 @@
       </w:tcPr>
     </w:tblStylePr>
   </w:style>
-  <w:style w:type="table" w:styleId="69">
+  <w:style w:type="table" w:styleId="758">
     <w:name w:val="List Table 1 Light - Accent 1"/>
-    <w:basedOn w:val="665"/>
+    <w:basedOn w:val="887"/>
     <w:uiPriority w:val="99"/>
     <w:pPr>
       <w:pBdr/>
@@ -14333,9 +14697,9 @@
       </w:tcPr>
     </w:tblStylePr>
   </w:style>
-  <w:style w:type="table" w:styleId="70">
+  <w:style w:type="table" w:styleId="759">
     <w:name w:val="List Table 1 Light - Accent 2"/>
-    <w:basedOn w:val="665"/>
+    <w:basedOn w:val="887"/>
     <w:uiPriority w:val="99"/>
     <w:pPr>
       <w:pBdr/>
@@ -14549,9 +14913,9 @@
       </w:tcPr>
     </w:tblStylePr>
   </w:style>
-  <w:style w:type="table" w:styleId="71">
+  <w:style w:type="table" w:styleId="760">
     <w:name w:val="List Table 1 Light - Accent 3"/>
-    <w:basedOn w:val="665"/>
+    <w:basedOn w:val="887"/>
     <w:uiPriority w:val="99"/>
     <w:pPr>
       <w:pBdr/>
@@ -14765,9 +15129,9 @@
       </w:tcPr>
     </w:tblStylePr>
   </w:style>
-  <w:style w:type="table" w:styleId="72">
+  <w:style w:type="table" w:styleId="761">
     <w:name w:val="List Table 1 Light - Accent 4"/>
-    <w:basedOn w:val="665"/>
+    <w:basedOn w:val="887"/>
     <w:uiPriority w:val="99"/>
     <w:pPr>
       <w:pBdr/>
@@ -14981,9 +15345,9 @@
       </w:tcPr>
     </w:tblStylePr>
   </w:style>
-  <w:style w:type="table" w:styleId="73">
+  <w:style w:type="table" w:styleId="762">
     <w:name w:val="List Table 1 Light - Accent 5"/>
-    <w:basedOn w:val="665"/>
+    <w:basedOn w:val="887"/>
     <w:uiPriority w:val="99"/>
     <w:pPr>
       <w:pBdr/>
@@ -15197,9 +15561,9 @@
       </w:tcPr>
     </w:tblStylePr>
   </w:style>
-  <w:style w:type="table" w:styleId="74">
+  <w:style w:type="table" w:styleId="763">
     <w:name w:val="List Table 1 Light - Accent 6"/>
-    <w:basedOn w:val="665"/>
+    <w:basedOn w:val="887"/>
     <w:uiPriority w:val="99"/>
     <w:pPr>
       <w:pBdr/>
@@ -15413,9 +15777,9 @@
       </w:tcPr>
     </w:tblStylePr>
   </w:style>
-  <w:style w:type="table" w:styleId="75">
+  <w:style w:type="table" w:styleId="764">
     <w:name w:val="List Table 2"/>
-    <w:basedOn w:val="665"/>
+    <w:basedOn w:val="887"/>
     <w:uiPriority w:val="99"/>
     <w:pPr>
       <w:pBdr/>
@@ -15651,9 +16015,9 @@
       </w:tcPr>
     </w:tblStylePr>
   </w:style>
-  <w:style w:type="table" w:styleId="76">
+  <w:style w:type="table" w:styleId="765">
     <w:name w:val="List Table 2 - Accent 1"/>
-    <w:basedOn w:val="665"/>
+    <w:basedOn w:val="887"/>
     <w:uiPriority w:val="99"/>
     <w:pPr>
       <w:pBdr/>
@@ -15889,9 +16253,9 @@
       </w:tcPr>
     </w:tblStylePr>
   </w:style>
-  <w:style w:type="table" w:styleId="77">
+  <w:style w:type="table" w:styleId="766">
     <w:name w:val="List Table 2 - Accent 2"/>
-    <w:basedOn w:val="665"/>
+    <w:basedOn w:val="887"/>
     <w:uiPriority w:val="99"/>
     <w:pPr>
       <w:pBdr/>
@@ -16127,9 +16491,9 @@
       </w:tcPr>
     </w:tblStylePr>
   </w:style>
-  <w:style w:type="table" w:styleId="78">
+  <w:style w:type="table" w:styleId="767">
     <w:name w:val="List Table 2 - Accent 3"/>
-    <w:basedOn w:val="665"/>
+    <w:basedOn w:val="887"/>
     <w:uiPriority w:val="99"/>
     <w:pPr>
       <w:pBdr/>
@@ -16365,9 +16729,9 @@
       </w:tcPr>
     </w:tblStylePr>
   </w:style>
-  <w:style w:type="table" w:styleId="79">
+  <w:style w:type="table" w:styleId="768">
     <w:name w:val="List Table 2 - Accent 4"/>
-    <w:basedOn w:val="665"/>
+    <w:basedOn w:val="887"/>
     <w:uiPriority w:val="99"/>
     <w:pPr>
       <w:pBdr/>
@@ -16603,9 +16967,9 @@
       </w:tcPr>
     </w:tblStylePr>
   </w:style>
-  <w:style w:type="table" w:styleId="80">
+  <w:style w:type="table" w:styleId="769">
     <w:name w:val="List Table 2 - Accent 5"/>
-    <w:basedOn w:val="665"/>
+    <w:basedOn w:val="887"/>
     <w:uiPriority w:val="99"/>
     <w:pPr>
       <w:pBdr/>
@@ -16841,9 +17205,9 @@
       </w:tcPr>
     </w:tblStylePr>
   </w:style>
-  <w:style w:type="table" w:styleId="81">
+  <w:style w:type="table" w:styleId="770">
     <w:name w:val="List Table 2 - Accent 6"/>
-    <w:basedOn w:val="665"/>
+    <w:basedOn w:val="887"/>
     <w:uiPriority w:val="99"/>
     <w:pPr>
       <w:pBdr/>
@@ -17079,9 +17443,9 @@
       </w:tcPr>
     </w:tblStylePr>
   </w:style>
-  <w:style w:type="table" w:styleId="82">
+  <w:style w:type="table" w:styleId="771">
     <w:name w:val="List Table 3"/>
-    <w:basedOn w:val="665"/>
+    <w:basedOn w:val="887"/>
     <w:uiPriority w:val="99"/>
     <w:pPr>
       <w:pBdr/>
@@ -17307,9 +17671,9 @@
       </w:tcPr>
     </w:tblStylePr>
   </w:style>
-  <w:style w:type="table" w:styleId="83">
+  <w:style w:type="table" w:styleId="772">
     <w:name w:val="List Table 3 - Accent 1"/>
-    <w:basedOn w:val="665"/>
+    <w:basedOn w:val="887"/>
     <w:uiPriority w:val="99"/>
     <w:pPr>
       <w:pBdr/>
@@ -17535,9 +17899,9 @@
       </w:tcPr>
     </w:tblStylePr>
   </w:style>
-  <w:style w:type="table" w:styleId="84">
+  <w:style w:type="table" w:styleId="773">
     <w:name w:val="List Table 3 - Accent 2"/>
-    <w:basedOn w:val="665"/>
+    <w:basedOn w:val="887"/>
     <w:uiPriority w:val="99"/>
     <w:pPr>
       <w:pBdr/>
@@ -17763,9 +18127,9 @@
       </w:tcPr>
     </w:tblStylePr>
   </w:style>
-  <w:style w:type="table" w:styleId="85">
+  <w:style w:type="table" w:styleId="774">
     <w:name w:val="List Table 3 - Accent 3"/>
-    <w:basedOn w:val="665"/>
+    <w:basedOn w:val="887"/>
     <w:uiPriority w:val="99"/>
     <w:pPr>
       <w:pBdr/>
@@ -17991,9 +18355,9 @@
       </w:tcPr>
     </w:tblStylePr>
   </w:style>
-  <w:style w:type="table" w:styleId="86">
+  <w:style w:type="table" w:styleId="775">
     <w:name w:val="List Table 3 - Accent 4"/>
-    <w:basedOn w:val="665"/>
+    <w:basedOn w:val="887"/>
     <w:uiPriority w:val="99"/>
     <w:pPr>
       <w:pBdr/>
@@ -18219,9 +18583,9 @@
       </w:tcPr>
     </w:tblStylePr>
   </w:style>
-  <w:style w:type="table" w:styleId="87">
+  <w:style w:type="table" w:styleId="776">
     <w:name w:val="List Table 3 - Accent 5"/>
-    <w:basedOn w:val="665"/>
+    <w:basedOn w:val="887"/>
     <w:uiPriority w:val="99"/>
     <w:pPr>
       <w:pBdr/>
@@ -18447,9 +18811,9 @@
       </w:tcPr>
     </w:tblStylePr>
   </w:style>
-  <w:style w:type="table" w:styleId="88">
+  <w:style w:type="table" w:styleId="777">
     <w:name w:val="List Table 3 - Accent 6"/>
-    <w:basedOn w:val="665"/>
+    <w:basedOn w:val="887"/>
     <w:uiPriority w:val="99"/>
     <w:pPr>
       <w:pBdr/>
@@ -18675,9 +19039,9 @@
       </w:tcPr>
     </w:tblStylePr>
   </w:style>
-  <w:style w:type="table" w:styleId="89">
+  <w:style w:type="table" w:styleId="778">
     <w:name w:val="List Table 4"/>
-    <w:basedOn w:val="665"/>
+    <w:basedOn w:val="887"/>
     <w:uiPriority w:val="99"/>
     <w:pPr>
       <w:pBdr/>
@@ -18900,9 +19264,9 @@
       </w:tcPr>
     </w:tblStylePr>
   </w:style>
-  <w:style w:type="table" w:styleId="90">
+  <w:style w:type="table" w:styleId="779">
     <w:name w:val="List Table 4 - Accent 1"/>
-    <w:basedOn w:val="665"/>
+    <w:basedOn w:val="887"/>
     <w:uiPriority w:val="99"/>
     <w:pPr>
       <w:pBdr/>
@@ -19125,9 +19489,9 @@
       </w:tcPr>
     </w:tblStylePr>
   </w:style>
-  <w:style w:type="table" w:styleId="91">
+  <w:style w:type="table" w:styleId="780">
     <w:name w:val="List Table 4 - Accent 2"/>
-    <w:basedOn w:val="665"/>
+    <w:basedOn w:val="887"/>
     <w:uiPriority w:val="99"/>
     <w:pPr>
       <w:pBdr/>
@@ -19350,9 +19714,9 @@
       </w:tcPr>
     </w:tblStylePr>
   </w:style>
-  <w:style w:type="table" w:styleId="92">
+  <w:style w:type="table" w:styleId="781">
     <w:name w:val="List Table 4 - Accent 3"/>
-    <w:basedOn w:val="665"/>
+    <w:basedOn w:val="887"/>
     <w:uiPriority w:val="99"/>
     <w:pPr>
       <w:pBdr/>
@@ -19575,9 +19939,9 @@
       </w:tcPr>
     </w:tblStylePr>
   </w:style>
-  <w:style w:type="table" w:styleId="93">
+  <w:style w:type="table" w:styleId="782">
     <w:name w:val="List Table 4 - Accent 4"/>
-    <w:basedOn w:val="665"/>
+    <w:basedOn w:val="887"/>
     <w:uiPriority w:val="99"/>
     <w:pPr>
       <w:pBdr/>
@@ -19800,9 +20164,9 @@
       </w:tcPr>
     </w:tblStylePr>
   </w:style>
-  <w:style w:type="table" w:styleId="94">
+  <w:style w:type="table" w:styleId="783">
     <w:name w:val="List Table 4 - Accent 5"/>
-    <w:basedOn w:val="665"/>
+    <w:basedOn w:val="887"/>
     <w:uiPriority w:val="99"/>
     <w:pPr>
       <w:pBdr/>
@@ -20025,9 +20389,9 @@
       </w:tcPr>
     </w:tblStylePr>
   </w:style>
-  <w:style w:type="table" w:styleId="95">
+  <w:style w:type="table" w:styleId="784">
     <w:name w:val="List Table 4 - Accent 6"/>
-    <w:basedOn w:val="665"/>
+    <w:basedOn w:val="887"/>
     <w:uiPriority w:val="99"/>
     <w:pPr>
       <w:pBdr/>
@@ -20250,9 +20614,9 @@
       </w:tcPr>
     </w:tblStylePr>
   </w:style>
-  <w:style w:type="table" w:styleId="96">
+  <w:style w:type="table" w:styleId="785">
     <w:name w:val="List Table 5 Dark"/>
-    <w:basedOn w:val="665"/>
+    <w:basedOn w:val="887"/>
     <w:uiPriority w:val="99"/>
     <w:pPr>
       <w:pBdr/>
@@ -20492,9 +20856,9 @@
       </w:tcPr>
     </w:tblStylePr>
   </w:style>
-  <w:style w:type="table" w:styleId="97">
+  <w:style w:type="table" w:styleId="786">
     <w:name w:val="List Table 5 Dark - Accent 1"/>
-    <w:basedOn w:val="665"/>
+    <w:basedOn w:val="887"/>
     <w:uiPriority w:val="99"/>
     <w:pPr>
       <w:pBdr/>
@@ -20734,9 +21098,9 @@
       </w:tcPr>
     </w:tblStylePr>
   </w:style>
-  <w:style w:type="table" w:styleId="98">
+  <w:style w:type="table" w:styleId="787">
     <w:name w:val="List Table 5 Dark - Accent 2"/>
-    <w:basedOn w:val="665"/>
+    <w:basedOn w:val="887"/>
     <w:uiPriority w:val="99"/>
     <w:pPr>
       <w:pBdr/>
@@ -20976,9 +21340,9 @@
       </w:tcPr>
     </w:tblStylePr>
   </w:style>
-  <w:style w:type="table" w:styleId="99">
+  <w:style w:type="table" w:styleId="788">
     <w:name w:val="List Table 5 Dark - Accent 3"/>
-    <w:basedOn w:val="665"/>
+    <w:basedOn w:val="887"/>
     <w:uiPriority w:val="99"/>
     <w:pPr>
       <w:pBdr/>
@@ -21218,9 +21582,9 @@
       </w:tcPr>
     </w:tblStylePr>
   </w:style>
-  <w:style w:type="table" w:styleId="100">
+  <w:style w:type="table" w:styleId="789">
     <w:name w:val="List Table 5 Dark - Accent 4"/>
-    <w:basedOn w:val="665"/>
+    <w:basedOn w:val="887"/>
     <w:uiPriority w:val="99"/>
     <w:pPr>
       <w:pBdr/>
@@ -21460,9 +21824,9 @@
       </w:tcPr>
     </w:tblStylePr>
   </w:style>
-  <w:style w:type="table" w:styleId="101">
+  <w:style w:type="table" w:styleId="790">
     <w:name w:val="List Table 5 Dark - Accent 5"/>
-    <w:basedOn w:val="665"/>
+    <w:basedOn w:val="887"/>
     <w:uiPriority w:val="99"/>
     <w:pPr>
       <w:pBdr/>
@@ -21702,9 +22066,9 @@
       </w:tcPr>
     </w:tblStylePr>
   </w:style>
-  <w:style w:type="table" w:styleId="102">
+  <w:style w:type="table" w:styleId="791">
     <w:name w:val="List Table 5 Dark - Accent 6"/>
-    <w:basedOn w:val="665"/>
+    <w:basedOn w:val="887"/>
     <w:uiPriority w:val="99"/>
     <w:pPr>
       <w:pBdr/>
@@ -21944,9 +22308,9 @@
       </w:tcPr>
     </w:tblStylePr>
   </w:style>
-  <w:style w:type="table" w:styleId="103">
+  <w:style w:type="table" w:styleId="792">
     <w:name w:val="List Table 6 Colorful"/>
-    <w:basedOn w:val="665"/>
+    <w:basedOn w:val="887"/>
     <w:uiPriority w:val="99"/>
     <w:pPr>
       <w:pBdr/>
@@ -22167,9 +22531,9 @@
       </w:tcPr>
     </w:tblStylePr>
   </w:style>
-  <w:style w:type="table" w:styleId="104">
+  <w:style w:type="table" w:styleId="793">
     <w:name w:val="List Table 6 Colorful - Accent 1"/>
-    <w:basedOn w:val="665"/>
+    <w:basedOn w:val="887"/>
     <w:uiPriority w:val="99"/>
     <w:pPr>
       <w:pBdr/>
@@ -22390,9 +22754,9 @@
       </w:tcPr>
     </w:tblStylePr>
   </w:style>
-  <w:style w:type="table" w:styleId="105">
+  <w:style w:type="table" w:styleId="794">
     <w:name w:val="List Table 6 Colorful - Accent 2"/>
-    <w:basedOn w:val="665"/>
+    <w:basedOn w:val="887"/>
     <w:uiPriority w:val="99"/>
     <w:pPr>
       <w:pBdr/>
@@ -22613,9 +22977,9 @@
       </w:tcPr>
     </w:tblStylePr>
   </w:style>
-  <w:style w:type="table" w:styleId="106">
+  <w:style w:type="table" w:styleId="795">
     <w:name w:val="List Table 6 Colorful - Accent 3"/>
-    <w:basedOn w:val="665"/>
+    <w:basedOn w:val="887"/>
     <w:uiPriority w:val="99"/>
     <w:pPr>
       <w:pBdr/>
@@ -22836,9 +23200,9 @@
       </w:tcPr>
     </w:tblStylePr>
   </w:style>
-  <w:style w:type="table" w:styleId="107">
+  <w:style w:type="table" w:styleId="796">
     <w:name w:val="List Table 6 Colorful - Accent 4"/>
-    <w:basedOn w:val="665"/>
+    <w:basedOn w:val="887"/>
     <w:uiPriority w:val="99"/>
     <w:pPr>
       <w:pBdr/>
@@ -23059,9 +23423,9 @@
       </w:tcPr>
     </w:tblStylePr>
   </w:style>
-  <w:style w:type="table" w:styleId="108">
+  <w:style w:type="table" w:styleId="797">
     <w:name w:val="List Table 6 Colorful - Accent 5"/>
-    <w:basedOn w:val="665"/>
+    <w:basedOn w:val="887"/>
     <w:uiPriority w:val="99"/>
     <w:pPr>
       <w:pBdr/>
@@ -23282,9 +23646,9 @@
       </w:tcPr>
     </w:tblStylePr>
   </w:style>
-  <w:style w:type="table" w:styleId="109">
+  <w:style w:type="table" w:styleId="798">
     <w:name w:val="List Table 6 Colorful - Accent 6"/>
-    <w:basedOn w:val="665"/>
+    <w:basedOn w:val="887"/>
     <w:uiPriority w:val="99"/>
     <w:pPr>
       <w:pBdr/>
@@ -23505,9 +23869,9 @@
       </w:tcPr>
     </w:tblStylePr>
   </w:style>
-  <w:style w:type="table" w:styleId="110">
+  <w:style w:type="table" w:styleId="799">
     <w:name w:val="List Table 7 Colorful"/>
-    <w:basedOn w:val="665"/>
+    <w:basedOn w:val="887"/>
     <w:uiPriority w:val="99"/>
     <w:pPr>
       <w:pBdr/>
@@ -23606,11 +23970,11 @@
         <w:tblBorders/>
       </w:tblPr>
       <w:tcPr>
-        <w:shd w:color="ffffff"/>
+        <w:shd w:val="clear" w:color="ffffff"/>
         <w:tcBorders>
-          <w:top w:val="none"/>
-          <w:left w:val="none"/>
-          <w:bottom w:val="none"/>
+          <w:top w:val="none" w:color="000000" w:sz="4" w:space="0"/>
+          <w:left w:val="none" w:color="000000" w:sz="4" w:space="0"/>
+          <w:bottom w:val="none" w:color="000000" w:sz="4" w:space="0"/>
           <w:right w:val="single" w:color="000000" w:themeColor="text1" w:themeTint="80" w:sz="4" w:space="0"/>
         </w:tcBorders>
       </w:tcPr>
@@ -23633,10 +23997,10 @@
       <w:tcPr>
         <w:shd w:val="clear" w:color="ffffff" w:themeColor="light1" w:fill="ffffff" w:themeFill="light1"/>
         <w:tcBorders>
-          <w:top w:val="none"/>
-          <w:left w:val="none"/>
+          <w:top w:val="none" w:color="000000" w:sz="4" w:space="0"/>
+          <w:left w:val="none" w:color="000000" w:sz="4" w:space="0"/>
           <w:bottom w:val="single" w:color="000000" w:themeColor="text1" w:themeTint="80" w:sz="4" w:space="0"/>
-          <w:right w:val="none"/>
+          <w:right w:val="none" w:color="000000" w:sz="4" w:space="0"/>
         </w:tcBorders>
       </w:tcPr>
     </w:tblStylePr>
@@ -23656,12 +24020,12 @@
         <w:tblBorders/>
       </w:tblPr>
       <w:tcPr>
-        <w:shd w:color="ffffff"/>
+        <w:shd w:val="clear" w:color="ffffff"/>
         <w:tcBorders>
-          <w:top w:val="none"/>
+          <w:top w:val="none" w:color="000000" w:sz="4" w:space="0"/>
           <w:left w:val="single" w:color="000000" w:themeColor="text1" w:themeTint="80" w:sz="4" w:space="0"/>
-          <w:bottom w:val="none"/>
-          <w:right w:val="none"/>
+          <w:bottom w:val="none" w:color="000000" w:sz="4" w:space="0"/>
+          <w:right w:val="none" w:color="000000" w:sz="4" w:space="0"/>
         </w:tcBorders>
       </w:tcPr>
     </w:tblStylePr>
@@ -23684,9 +24048,9 @@
         <w:shd w:val="clear" w:color="ffffff" w:themeColor="light1" w:fill="ffffff" w:themeFill="light1"/>
         <w:tcBorders>
           <w:top w:val="single" w:color="000000" w:themeColor="text1" w:themeTint="80" w:sz="4" w:space="0"/>
-          <w:left w:val="none"/>
-          <w:bottom w:val="none"/>
-          <w:right w:val="none"/>
+          <w:left w:val="none" w:color="000000" w:sz="4" w:space="0"/>
+          <w:bottom w:val="none" w:color="000000" w:sz="4" w:space="0"/>
+          <w:right w:val="none" w:color="000000" w:sz="4" w:space="0"/>
         </w:tcBorders>
       </w:tcPr>
     </w:tblStylePr>
@@ -23761,9 +24125,9 @@
       </w:tcPr>
     </w:tblStylePr>
   </w:style>
-  <w:style w:type="table" w:styleId="111">
+  <w:style w:type="table" w:styleId="800">
     <w:name w:val="List Table 7 Colorful - Accent 1"/>
-    <w:basedOn w:val="665"/>
+    <w:basedOn w:val="887"/>
     <w:uiPriority w:val="99"/>
     <w:pPr>
       <w:pBdr/>
@@ -23862,11 +24226,11 @@
         <w:tblBorders/>
       </w:tblPr>
       <w:tcPr>
-        <w:shd w:color="ffffff"/>
+        <w:shd w:val="clear" w:color="ffffff"/>
         <w:tcBorders>
-          <w:top w:val="none"/>
-          <w:left w:val="none"/>
-          <w:bottom w:val="none"/>
+          <w:top w:val="none" w:color="000000" w:sz="4" w:space="0"/>
+          <w:left w:val="none" w:color="000000" w:sz="4" w:space="0"/>
+          <w:bottom w:val="none" w:color="000000" w:sz="4" w:space="0"/>
           <w:right w:val="single" w:color="000000" w:themeColor="accent1" w:sz="4" w:space="0"/>
         </w:tcBorders>
       </w:tcPr>
@@ -23889,10 +24253,10 @@
       <w:tcPr>
         <w:shd w:val="clear" w:color="ffffff" w:themeColor="light1" w:fill="ffffff" w:themeFill="light1"/>
         <w:tcBorders>
-          <w:top w:val="none"/>
-          <w:left w:val="none"/>
+          <w:top w:val="none" w:color="000000" w:sz="4" w:space="0"/>
+          <w:left w:val="none" w:color="000000" w:sz="4" w:space="0"/>
           <w:bottom w:val="single" w:color="000000" w:themeColor="accent1" w:sz="4" w:space="0"/>
-          <w:right w:val="none"/>
+          <w:right w:val="none" w:color="000000" w:sz="4" w:space="0"/>
         </w:tcBorders>
       </w:tcPr>
     </w:tblStylePr>
@@ -23912,12 +24276,12 @@
         <w:tblBorders/>
       </w:tblPr>
       <w:tcPr>
-        <w:shd w:color="ffffff"/>
+        <w:shd w:val="clear" w:color="ffffff"/>
         <w:tcBorders>
-          <w:top w:val="none"/>
+          <w:top w:val="none" w:color="000000" w:sz="4" w:space="0"/>
           <w:left w:val="single" w:color="000000" w:themeColor="accent1" w:sz="4" w:space="0"/>
-          <w:bottom w:val="none"/>
-          <w:right w:val="none"/>
+          <w:bottom w:val="none" w:color="000000" w:sz="4" w:space="0"/>
+          <w:right w:val="none" w:color="000000" w:sz="4" w:space="0"/>
         </w:tcBorders>
       </w:tcPr>
     </w:tblStylePr>
@@ -23940,9 +24304,9 @@
         <w:shd w:val="clear" w:color="ffffff" w:themeColor="light1" w:fill="ffffff" w:themeFill="light1"/>
         <w:tcBorders>
           <w:top w:val="single" w:color="000000" w:themeColor="accent1" w:sz="4" w:space="0"/>
-          <w:left w:val="none"/>
-          <w:bottom w:val="none"/>
-          <w:right w:val="none"/>
+          <w:left w:val="none" w:color="000000" w:sz="4" w:space="0"/>
+          <w:bottom w:val="none" w:color="000000" w:sz="4" w:space="0"/>
+          <w:right w:val="none" w:color="000000" w:sz="4" w:space="0"/>
         </w:tcBorders>
       </w:tcPr>
     </w:tblStylePr>
@@ -24017,9 +24381,9 @@
       </w:tcPr>
     </w:tblStylePr>
   </w:style>
-  <w:style w:type="table" w:styleId="112">
+  <w:style w:type="table" w:styleId="801">
     <w:name w:val="List Table 7 Colorful - Accent 2"/>
-    <w:basedOn w:val="665"/>
+    <w:basedOn w:val="887"/>
     <w:uiPriority w:val="99"/>
     <w:pPr>
       <w:pBdr/>
@@ -24118,11 +24482,11 @@
         <w:tblBorders/>
       </w:tblPr>
       <w:tcPr>
-        <w:shd w:color="ffffff"/>
+        <w:shd w:val="clear" w:color="ffffff"/>
         <w:tcBorders>
-          <w:top w:val="none"/>
-          <w:left w:val="none"/>
-          <w:bottom w:val="none"/>
+          <w:top w:val="none" w:color="000000" w:sz="4" w:space="0"/>
+          <w:left w:val="none" w:color="000000" w:sz="4" w:space="0"/>
+          <w:bottom w:val="none" w:color="000000" w:sz="4" w:space="0"/>
           <w:right w:val="single" w:color="000000" w:themeColor="accent2" w:themeTint="97" w:sz="4" w:space="0"/>
         </w:tcBorders>
       </w:tcPr>
@@ -24145,10 +24509,10 @@
       <w:tcPr>
         <w:shd w:val="clear" w:color="ffffff" w:themeColor="light1" w:fill="ffffff" w:themeFill="light1"/>
         <w:tcBorders>
-          <w:top w:val="none"/>
-          <w:left w:val="none"/>
+          <w:top w:val="none" w:color="000000" w:sz="4" w:space="0"/>
+          <w:left w:val="none" w:color="000000" w:sz="4" w:space="0"/>
           <w:bottom w:val="single" w:color="000000" w:themeColor="accent2" w:themeTint="97" w:sz="4" w:space="0"/>
-          <w:right w:val="none"/>
+          <w:right w:val="none" w:color="000000" w:sz="4" w:space="0"/>
         </w:tcBorders>
       </w:tcPr>
     </w:tblStylePr>
@@ -24168,12 +24532,12 @@
         <w:tblBorders/>
       </w:tblPr>
       <w:tcPr>
-        <w:shd w:color="ffffff"/>
+        <w:shd w:val="clear" w:color="ffffff"/>
         <w:tcBorders>
-          <w:top w:val="none"/>
+          <w:top w:val="none" w:color="000000" w:sz="4" w:space="0"/>
           <w:left w:val="single" w:color="000000" w:themeColor="accent2" w:themeTint="97" w:sz="4" w:space="0"/>
-          <w:bottom w:val="none"/>
-          <w:right w:val="none"/>
+          <w:bottom w:val="none" w:color="000000" w:sz="4" w:space="0"/>
+          <w:right w:val="none" w:color="000000" w:sz="4" w:space="0"/>
         </w:tcBorders>
       </w:tcPr>
     </w:tblStylePr>
@@ -24196,9 +24560,9 @@
         <w:shd w:val="clear" w:color="ffffff" w:themeColor="light1" w:fill="ffffff" w:themeFill="light1"/>
         <w:tcBorders>
           <w:top w:val="single" w:color="000000" w:themeColor="accent2" w:themeTint="97" w:sz="4" w:space="0"/>
-          <w:left w:val="none"/>
-          <w:bottom w:val="none"/>
-          <w:right w:val="none"/>
+          <w:left w:val="none" w:color="000000" w:sz="4" w:space="0"/>
+          <w:bottom w:val="none" w:color="000000" w:sz="4" w:space="0"/>
+          <w:right w:val="none" w:color="000000" w:sz="4" w:space="0"/>
         </w:tcBorders>
       </w:tcPr>
     </w:tblStylePr>
@@ -24273,9 +24637,9 @@
       </w:tcPr>
     </w:tblStylePr>
   </w:style>
-  <w:style w:type="table" w:styleId="113">
+  <w:style w:type="table" w:styleId="802">
     <w:name w:val="List Table 7 Colorful - Accent 3"/>
-    <w:basedOn w:val="665"/>
+    <w:basedOn w:val="887"/>
     <w:uiPriority w:val="99"/>
     <w:pPr>
       <w:pBdr/>
@@ -24374,11 +24738,11 @@
         <w:tblBorders/>
       </w:tblPr>
       <w:tcPr>
-        <w:shd w:color="ffffff"/>
+        <w:shd w:val="clear" w:color="ffffff"/>
         <w:tcBorders>
-          <w:top w:val="none"/>
-          <w:left w:val="none"/>
-          <w:bottom w:val="none"/>
+          <w:top w:val="none" w:color="000000" w:sz="4" w:space="0"/>
+          <w:left w:val="none" w:color="000000" w:sz="4" w:space="0"/>
+          <w:bottom w:val="none" w:color="000000" w:sz="4" w:space="0"/>
           <w:right w:val="single" w:color="000000" w:themeColor="accent3" w:themeTint="98" w:sz="4" w:space="0"/>
         </w:tcBorders>
       </w:tcPr>
@@ -24401,10 +24765,10 @@
       <w:tcPr>
         <w:shd w:val="clear" w:color="ffffff" w:themeColor="light1" w:fill="ffffff" w:themeFill="light1"/>
         <w:tcBorders>
-          <w:top w:val="none"/>
-          <w:left w:val="none"/>
+          <w:top w:val="none" w:color="000000" w:sz="4" w:space="0"/>
+          <w:left w:val="none" w:color="000000" w:sz="4" w:space="0"/>
           <w:bottom w:val="single" w:color="000000" w:themeColor="accent3" w:themeTint="98" w:sz="4" w:space="0"/>
-          <w:right w:val="none"/>
+          <w:right w:val="none" w:color="000000" w:sz="4" w:space="0"/>
         </w:tcBorders>
       </w:tcPr>
     </w:tblStylePr>
@@ -24424,12 +24788,12 @@
         <w:tblBorders/>
       </w:tblPr>
       <w:tcPr>
-        <w:shd w:color="ffffff"/>
+        <w:shd w:val="clear" w:color="ffffff"/>
         <w:tcBorders>
-          <w:top w:val="none"/>
+          <w:top w:val="none" w:color="000000" w:sz="4" w:space="0"/>
           <w:left w:val="single" w:color="000000" w:themeColor="accent3" w:themeTint="98" w:sz="4" w:space="0"/>
-          <w:bottom w:val="none"/>
-          <w:right w:val="none"/>
+          <w:bottom w:val="none" w:color="000000" w:sz="4" w:space="0"/>
+          <w:right w:val="none" w:color="000000" w:sz="4" w:space="0"/>
         </w:tcBorders>
       </w:tcPr>
     </w:tblStylePr>
@@ -24452,9 +24816,9 @@
         <w:shd w:val="clear" w:color="ffffff" w:themeColor="light1" w:fill="ffffff" w:themeFill="light1"/>
         <w:tcBorders>
           <w:top w:val="single" w:color="000000" w:themeColor="accent3" w:themeTint="98" w:sz="4" w:space="0"/>
-          <w:left w:val="none"/>
-          <w:bottom w:val="none"/>
-          <w:right w:val="none"/>
+          <w:left w:val="none" w:color="000000" w:sz="4" w:space="0"/>
+          <w:bottom w:val="none" w:color="000000" w:sz="4" w:space="0"/>
+          <w:right w:val="none" w:color="000000" w:sz="4" w:space="0"/>
         </w:tcBorders>
       </w:tcPr>
     </w:tblStylePr>
@@ -24529,9 +24893,9 @@
       </w:tcPr>
     </w:tblStylePr>
   </w:style>
-  <w:style w:type="table" w:styleId="114">
+  <w:style w:type="table" w:styleId="803">
     <w:name w:val="List Table 7 Colorful - Accent 4"/>
-    <w:basedOn w:val="665"/>
+    <w:basedOn w:val="887"/>
     <w:uiPriority w:val="99"/>
     <w:pPr>
       <w:pBdr/>
@@ -24630,11 +24994,11 @@
         <w:tblBorders/>
       </w:tblPr>
       <w:tcPr>
-        <w:shd w:color="ffffff"/>
+        <w:shd w:val="clear" w:color="ffffff"/>
         <w:tcBorders>
-          <w:top w:val="none"/>
-          <w:left w:val="none"/>
-          <w:bottom w:val="none"/>
+          <w:top w:val="none" w:color="000000" w:sz="4" w:space="0"/>
+          <w:left w:val="none" w:color="000000" w:sz="4" w:space="0"/>
+          <w:bottom w:val="none" w:color="000000" w:sz="4" w:space="0"/>
           <w:right w:val="single" w:color="000000" w:themeColor="accent4" w:themeTint="9A" w:sz="4" w:space="0"/>
         </w:tcBorders>
       </w:tcPr>
@@ -24657,10 +25021,10 @@
       <w:tcPr>
         <w:shd w:val="clear" w:color="ffffff" w:themeColor="light1" w:fill="ffffff" w:themeFill="light1"/>
         <w:tcBorders>
-          <w:top w:val="none"/>
-          <w:left w:val="none"/>
+          <w:top w:val="none" w:color="000000" w:sz="4" w:space="0"/>
+          <w:left w:val="none" w:color="000000" w:sz="4" w:space="0"/>
           <w:bottom w:val="single" w:color="000000" w:themeColor="accent4" w:themeTint="9A" w:sz="4" w:space="0"/>
-          <w:right w:val="none"/>
+          <w:right w:val="none" w:color="000000" w:sz="4" w:space="0"/>
         </w:tcBorders>
       </w:tcPr>
     </w:tblStylePr>
@@ -24680,12 +25044,12 @@
         <w:tblBorders/>
       </w:tblPr>
       <w:tcPr>
-        <w:shd w:color="ffffff"/>
+        <w:shd w:val="clear" w:color="ffffff"/>
         <w:tcBorders>
-          <w:top w:val="none"/>
+          <w:top w:val="none" w:color="000000" w:sz="4" w:space="0"/>
           <w:left w:val="single" w:color="000000" w:themeColor="accent4" w:themeTint="9A" w:sz="4" w:space="0"/>
-          <w:bottom w:val="none"/>
-          <w:right w:val="none"/>
+          <w:bottom w:val="none" w:color="000000" w:sz="4" w:space="0"/>
+          <w:right w:val="none" w:color="000000" w:sz="4" w:space="0"/>
         </w:tcBorders>
       </w:tcPr>
     </w:tblStylePr>
@@ -24708,9 +25072,9 @@
         <w:shd w:val="clear" w:color="ffffff" w:themeColor="light1" w:fill="ffffff" w:themeFill="light1"/>
         <w:tcBorders>
           <w:top w:val="single" w:color="000000" w:themeColor="accent4" w:themeTint="9A" w:sz="4" w:space="0"/>
-          <w:left w:val="none"/>
-          <w:bottom w:val="none"/>
-          <w:right w:val="none"/>
+          <w:left w:val="none" w:color="000000" w:sz="4" w:space="0"/>
+          <w:bottom w:val="none" w:color="000000" w:sz="4" w:space="0"/>
+          <w:right w:val="none" w:color="000000" w:sz="4" w:space="0"/>
         </w:tcBorders>
       </w:tcPr>
     </w:tblStylePr>
@@ -24785,9 +25149,9 @@
       </w:tcPr>
     </w:tblStylePr>
   </w:style>
-  <w:style w:type="table" w:styleId="115">
+  <w:style w:type="table" w:styleId="804">
     <w:name w:val="List Table 7 Colorful - Accent 5"/>
-    <w:basedOn w:val="665"/>
+    <w:basedOn w:val="887"/>
     <w:uiPriority w:val="99"/>
     <w:pPr>
       <w:pBdr/>
@@ -24886,11 +25250,11 @@
         <w:tblBorders/>
       </w:tblPr>
       <w:tcPr>
-        <w:shd w:color="ffffff"/>
+        <w:shd w:val="clear" w:color="ffffff"/>
         <w:tcBorders>
-          <w:top w:val="none"/>
-          <w:left w:val="none"/>
-          <w:bottom w:val="none"/>
+          <w:top w:val="none" w:color="000000" w:sz="4" w:space="0"/>
+          <w:left w:val="none" w:color="000000" w:sz="4" w:space="0"/>
+          <w:bottom w:val="none" w:color="000000" w:sz="4" w:space="0"/>
           <w:right w:val="single" w:color="000000" w:themeColor="accent5" w:themeTint="9A" w:sz="4" w:space="0"/>
         </w:tcBorders>
       </w:tcPr>
@@ -24913,10 +25277,10 @@
       <w:tcPr>
         <w:shd w:val="clear" w:color="ffffff" w:themeColor="light1" w:fill="ffffff" w:themeFill="light1"/>
         <w:tcBorders>
-          <w:top w:val="none"/>
-          <w:left w:val="none"/>
+          <w:top w:val="none" w:color="000000" w:sz="4" w:space="0"/>
+          <w:left w:val="none" w:color="000000" w:sz="4" w:space="0"/>
           <w:bottom w:val="single" w:color="000000" w:themeColor="accent5" w:themeTint="9A" w:sz="4" w:space="0"/>
-          <w:right w:val="none"/>
+          <w:right w:val="none" w:color="000000" w:sz="4" w:space="0"/>
         </w:tcBorders>
       </w:tcPr>
     </w:tblStylePr>
@@ -24936,12 +25300,12 @@
         <w:tblBorders/>
       </w:tblPr>
       <w:tcPr>
-        <w:shd w:color="ffffff"/>
+        <w:shd w:val="clear" w:color="ffffff"/>
         <w:tcBorders>
-          <w:top w:val="none"/>
+          <w:top w:val="none" w:color="000000" w:sz="4" w:space="0"/>
           <w:left w:val="single" w:color="000000" w:themeColor="accent5" w:themeTint="9A" w:sz="4" w:space="0"/>
-          <w:bottom w:val="none"/>
-          <w:right w:val="none"/>
+          <w:bottom w:val="none" w:color="000000" w:sz="4" w:space="0"/>
+          <w:right w:val="none" w:color="000000" w:sz="4" w:space="0"/>
         </w:tcBorders>
       </w:tcPr>
     </w:tblStylePr>
@@ -24964,9 +25328,9 @@
         <w:shd w:val="clear" w:color="ffffff" w:themeColor="light1" w:fill="ffffff" w:themeFill="light1"/>
         <w:tcBorders>
           <w:top w:val="single" w:color="000000" w:themeColor="accent5" w:themeTint="9A" w:sz="4" w:space="0"/>
-          <w:left w:val="none"/>
-          <w:bottom w:val="none"/>
-          <w:right w:val="none"/>
+          <w:left w:val="none" w:color="000000" w:sz="4" w:space="0"/>
+          <w:bottom w:val="none" w:color="000000" w:sz="4" w:space="0"/>
+          <w:right w:val="none" w:color="000000" w:sz="4" w:space="0"/>
         </w:tcBorders>
       </w:tcPr>
     </w:tblStylePr>
@@ -25041,9 +25405,9 @@
       </w:tcPr>
     </w:tblStylePr>
   </w:style>
-  <w:style w:type="table" w:styleId="116">
+  <w:style w:type="table" w:styleId="805">
     <w:name w:val="List Table 7 Colorful - Accent 6"/>
-    <w:basedOn w:val="665"/>
+    <w:basedOn w:val="887"/>
     <w:uiPriority w:val="99"/>
     <w:pPr>
       <w:pBdr/>
@@ -25142,11 +25506,11 @@
         <w:tblBorders/>
       </w:tblPr>
       <w:tcPr>
-        <w:shd w:color="ffffff"/>
+        <w:shd w:val="clear" w:color="ffffff"/>
         <w:tcBorders>
-          <w:top w:val="none"/>
-          <w:left w:val="none"/>
-          <w:bottom w:val="none"/>
+          <w:top w:val="none" w:color="000000" w:sz="4" w:space="0"/>
+          <w:left w:val="none" w:color="000000" w:sz="4" w:space="0"/>
+          <w:bottom w:val="none" w:color="000000" w:sz="4" w:space="0"/>
           <w:right w:val="single" w:color="000000" w:themeColor="accent6" w:themeTint="98" w:sz="4" w:space="0"/>
         </w:tcBorders>
       </w:tcPr>
@@ -25169,10 +25533,10 @@
       <w:tcPr>
         <w:shd w:val="clear" w:color="ffffff" w:themeColor="light1" w:fill="ffffff" w:themeFill="light1"/>
         <w:tcBorders>
-          <w:top w:val="none"/>
-          <w:left w:val="none"/>
+          <w:top w:val="none" w:color="000000" w:sz="4" w:space="0"/>
+          <w:left w:val="none" w:color="000000" w:sz="4" w:space="0"/>
           <w:bottom w:val="single" w:color="000000" w:themeColor="accent6" w:themeTint="98" w:sz="4" w:space="0"/>
-          <w:right w:val="none"/>
+          <w:right w:val="none" w:color="000000" w:sz="4" w:space="0"/>
         </w:tcBorders>
       </w:tcPr>
     </w:tblStylePr>
@@ -25192,12 +25556,12 @@
         <w:tblBorders/>
       </w:tblPr>
       <w:tcPr>
-        <w:shd w:color="ffffff"/>
+        <w:shd w:val="clear" w:color="ffffff"/>
         <w:tcBorders>
-          <w:top w:val="none"/>
+          <w:top w:val="none" w:color="000000" w:sz="4" w:space="0"/>
           <w:left w:val="single" w:color="000000" w:themeColor="accent6" w:themeTint="98" w:sz="4" w:space="0"/>
-          <w:bottom w:val="none"/>
-          <w:right w:val="none"/>
+          <w:bottom w:val="none" w:color="000000" w:sz="4" w:space="0"/>
+          <w:right w:val="none" w:color="000000" w:sz="4" w:space="0"/>
         </w:tcBorders>
       </w:tcPr>
     </w:tblStylePr>
@@ -25220,9 +25584,9 @@
         <w:shd w:val="clear" w:color="ffffff" w:themeColor="light1" w:fill="ffffff" w:themeFill="light1"/>
         <w:tcBorders>
           <w:top w:val="single" w:color="000000" w:themeColor="accent6" w:themeTint="98" w:sz="4" w:space="0"/>
-          <w:left w:val="none"/>
-          <w:bottom w:val="none"/>
-          <w:right w:val="none"/>
+          <w:left w:val="none" w:color="000000" w:sz="4" w:space="0"/>
+          <w:bottom w:val="none" w:color="000000" w:sz="4" w:space="0"/>
+          <w:right w:val="none" w:color="000000" w:sz="4" w:space="0"/>
         </w:tcBorders>
       </w:tcPr>
     </w:tblStylePr>
@@ -25297,9 +25661,9 @@
       </w:tcPr>
     </w:tblStylePr>
   </w:style>
-  <w:style w:type="table" w:styleId="117">
+  <w:style w:type="table" w:styleId="806">
     <w:name w:val="Lined - Accent"/>
-    <w:basedOn w:val="665"/>
+    <w:basedOn w:val="887"/>
     <w:uiPriority w:val="99"/>
     <w:pPr>
       <w:pBdr/>
@@ -25534,9 +25898,9 @@
       </w:tcPr>
     </w:tblStylePr>
   </w:style>
-  <w:style w:type="table" w:styleId="118">
+  <w:style w:type="table" w:styleId="807">
     <w:name w:val="Lined - Accent 1"/>
-    <w:basedOn w:val="665"/>
+    <w:basedOn w:val="887"/>
     <w:uiPriority w:val="99"/>
     <w:pPr>
       <w:pBdr/>
@@ -25771,9 +26135,9 @@
       </w:tcPr>
     </w:tblStylePr>
   </w:style>
-  <w:style w:type="table" w:styleId="119">
+  <w:style w:type="table" w:styleId="808">
     <w:name w:val="Lined - Accent 2"/>
-    <w:basedOn w:val="665"/>
+    <w:basedOn w:val="887"/>
     <w:uiPriority w:val="99"/>
     <w:pPr>
       <w:pBdr/>
@@ -26008,9 +26372,9 @@
       </w:tcPr>
     </w:tblStylePr>
   </w:style>
-  <w:style w:type="table" w:styleId="120">
+  <w:style w:type="table" w:styleId="809">
     <w:name w:val="Lined - Accent 3"/>
-    <w:basedOn w:val="665"/>
+    <w:basedOn w:val="887"/>
     <w:uiPriority w:val="99"/>
     <w:pPr>
       <w:pBdr/>
@@ -26245,9 +26609,9 @@
       </w:tcPr>
     </w:tblStylePr>
   </w:style>
-  <w:style w:type="table" w:styleId="121">
+  <w:style w:type="table" w:styleId="810">
     <w:name w:val="Lined - Accent 4"/>
-    <w:basedOn w:val="665"/>
+    <w:basedOn w:val="887"/>
     <w:uiPriority w:val="99"/>
     <w:pPr>
       <w:pBdr/>
@@ -26482,9 +26846,9 @@
       </w:tcPr>
     </w:tblStylePr>
   </w:style>
-  <w:style w:type="table" w:styleId="122">
+  <w:style w:type="table" w:styleId="811">
     <w:name w:val="Lined - Accent 5"/>
-    <w:basedOn w:val="665"/>
+    <w:basedOn w:val="887"/>
     <w:uiPriority w:val="99"/>
     <w:pPr>
       <w:pBdr/>
@@ -26719,9 +27083,9 @@
       </w:tcPr>
     </w:tblStylePr>
   </w:style>
-  <w:style w:type="table" w:styleId="123">
+  <w:style w:type="table" w:styleId="812">
     <w:name w:val="Lined - Accent 6"/>
-    <w:basedOn w:val="665"/>
+    <w:basedOn w:val="887"/>
     <w:uiPriority w:val="99"/>
     <w:pPr>
       <w:pBdr/>
@@ -26956,9 +27320,9 @@
       </w:tcPr>
     </w:tblStylePr>
   </w:style>
-  <w:style w:type="table" w:styleId="124">
+  <w:style w:type="table" w:styleId="813">
     <w:name w:val="Bordered &amp; Lined - Accent"/>
-    <w:basedOn w:val="665"/>
+    <w:basedOn w:val="887"/>
     <w:uiPriority w:val="99"/>
     <w:pPr>
       <w:pBdr/>
@@ -27200,9 +27564,9 @@
       </w:tcPr>
     </w:tblStylePr>
   </w:style>
-  <w:style w:type="table" w:styleId="125">
+  <w:style w:type="table" w:styleId="814">
     <w:name w:val="Bordered &amp; Lined - Accent 1"/>
-    <w:basedOn w:val="665"/>
+    <w:basedOn w:val="887"/>
     <w:uiPriority w:val="99"/>
     <w:pPr>
       <w:pBdr/>
@@ -27444,9 +27808,9 @@
       </w:tcPr>
     </w:tblStylePr>
   </w:style>
-  <w:style w:type="table" w:styleId="126">
+  <w:style w:type="table" w:styleId="815">
     <w:name w:val="Bordered &amp; Lined - Accent 2"/>
-    <w:basedOn w:val="665"/>
+    <w:basedOn w:val="887"/>
     <w:uiPriority w:val="99"/>
     <w:pPr>
       <w:pBdr/>
@@ -27688,9 +28052,9 @@
       </w:tcPr>
     </w:tblStylePr>
   </w:style>
-  <w:style w:type="table" w:styleId="127">
+  <w:style w:type="table" w:styleId="816">
     <w:name w:val="Bordered &amp; Lined - Accent 3"/>
-    <w:basedOn w:val="665"/>
+    <w:basedOn w:val="887"/>
     <w:uiPriority w:val="99"/>
     <w:pPr>
       <w:pBdr/>
@@ -27932,9 +28296,9 @@
       </w:tcPr>
     </w:tblStylePr>
   </w:style>
-  <w:style w:type="table" w:styleId="128">
+  <w:style w:type="table" w:styleId="817">
     <w:name w:val="Bordered &amp; Lined - Accent 4"/>
-    <w:basedOn w:val="665"/>
+    <w:basedOn w:val="887"/>
     <w:uiPriority w:val="99"/>
     <w:pPr>
       <w:pBdr/>
@@ -28176,9 +28540,9 @@
       </w:tcPr>
     </w:tblStylePr>
   </w:style>
-  <w:style w:type="table" w:styleId="129">
+  <w:style w:type="table" w:styleId="818">
     <w:name w:val="Bordered &amp; Lined - Accent 5"/>
-    <w:basedOn w:val="665"/>
+    <w:basedOn w:val="887"/>
     <w:uiPriority w:val="99"/>
     <w:pPr>
       <w:pBdr/>
@@ -28420,9 +28784,9 @@
       </w:tcPr>
     </w:tblStylePr>
   </w:style>
-  <w:style w:type="table" w:styleId="130">
+  <w:style w:type="table" w:styleId="819">
     <w:name w:val="Bordered &amp; Lined - Accent 6"/>
-    <w:basedOn w:val="665"/>
+    <w:basedOn w:val="887"/>
     <w:uiPriority w:val="99"/>
     <w:pPr>
       <w:pBdr/>
@@ -28664,9 +29028,9 @@
       </w:tcPr>
     </w:tblStylePr>
   </w:style>
-  <w:style w:type="table" w:styleId="131">
+  <w:style w:type="table" w:styleId="820">
     <w:name w:val="Bordered"/>
-    <w:basedOn w:val="665"/>
+    <w:basedOn w:val="887"/>
     <w:uiPriority w:val="99"/>
     <w:pPr>
       <w:pBdr/>
@@ -28895,9 +29259,9 @@
       </w:tcPr>
     </w:tblStylePr>
   </w:style>
-  <w:style w:type="table" w:styleId="132">
+  <w:style w:type="table" w:styleId="821">
     <w:name w:val="Bordered - Accent 1"/>
-    <w:basedOn w:val="665"/>
+    <w:basedOn w:val="887"/>
     <w:uiPriority w:val="99"/>
     <w:pPr>
       <w:pBdr/>
@@ -29126,9 +29490,9 @@
       </w:tcPr>
     </w:tblStylePr>
   </w:style>
-  <w:style w:type="table" w:styleId="133">
+  <w:style w:type="table" w:styleId="822">
     <w:name w:val="Bordered - Accent 2"/>
-    <w:basedOn w:val="665"/>
+    <w:basedOn w:val="887"/>
     <w:uiPriority w:val="99"/>
     <w:pPr>
       <w:pBdr/>
@@ -29357,9 +29721,9 @@
       </w:tcPr>
     </w:tblStylePr>
   </w:style>
-  <w:style w:type="table" w:styleId="134">
+  <w:style w:type="table" w:styleId="823">
     <w:name w:val="Bordered - Accent 3"/>
-    <w:basedOn w:val="665"/>
+    <w:basedOn w:val="887"/>
     <w:uiPriority w:val="99"/>
     <w:pPr>
       <w:pBdr/>
@@ -29588,9 +29952,9 @@
       </w:tcPr>
     </w:tblStylePr>
   </w:style>
-  <w:style w:type="table" w:styleId="135">
+  <w:style w:type="table" w:styleId="824">
     <w:name w:val="Bordered - Accent 4"/>
-    <w:basedOn w:val="665"/>
+    <w:basedOn w:val="887"/>
     <w:uiPriority w:val="99"/>
     <w:pPr>
       <w:pBdr/>
@@ -29819,9 +30183,9 @@
       </w:tcPr>
     </w:tblStylePr>
   </w:style>
-  <w:style w:type="table" w:styleId="136">
+  <w:style w:type="table" w:styleId="825">
     <w:name w:val="Bordered - Accent 5"/>
-    <w:basedOn w:val="665"/>
+    <w:basedOn w:val="887"/>
     <w:uiPriority w:val="99"/>
     <w:pPr>
       <w:pBdr/>
@@ -30050,9 +30414,9 @@
       </w:tcPr>
     </w:tblStylePr>
   </w:style>
-  <w:style w:type="table" w:styleId="137">
+  <w:style w:type="table" w:styleId="826">
     <w:name w:val="Bordered - Accent 6"/>
-    <w:basedOn w:val="665"/>
+    <w:basedOn w:val="887"/>
     <w:uiPriority w:val="99"/>
     <w:pPr>
       <w:pBdr/>
@@ -30281,11 +30645,11 @@
       </w:tcPr>
     </w:tblStylePr>
   </w:style>
-  <w:style w:type="paragraph" w:styleId="139">
+  <w:style w:type="paragraph" w:styleId="827">
     <w:name w:val="Heading 1"/>
-    <w:basedOn w:val="664"/>
-    <w:next w:val="664"/>
-    <w:link w:val="150"/>
+    <w:basedOn w:val="886"/>
+    <w:next w:val="886"/>
+    <w:link w:val="837"/>
     <w:uiPriority w:val="9"/>
     <w:qFormat/>
     <w:pPr>
@@ -30303,11 +30667,11 @@
       <w:szCs w:val="40"/>
     </w:rPr>
   </w:style>
-  <w:style w:type="paragraph" w:styleId="140">
+  <w:style w:type="paragraph" w:styleId="828">
     <w:name w:val="Heading 2"/>
-    <w:basedOn w:val="664"/>
-    <w:next w:val="664"/>
-    <w:link w:val="151"/>
+    <w:basedOn w:val="886"/>
+    <w:next w:val="886"/>
+    <w:link w:val="838"/>
     <w:uiPriority w:val="9"/>
     <w:unhideWhenUsed/>
     <w:qFormat/>
@@ -30326,11 +30690,11 @@
       <w:szCs w:val="32"/>
     </w:rPr>
   </w:style>
-  <w:style w:type="paragraph" w:styleId="141">
+  <w:style w:type="paragraph" w:styleId="829">
     <w:name w:val="Heading 3"/>
-    <w:basedOn w:val="664"/>
-    <w:next w:val="664"/>
-    <w:link w:val="152"/>
+    <w:basedOn w:val="886"/>
+    <w:next w:val="886"/>
+    <w:link w:val="839"/>
     <w:uiPriority w:val="9"/>
     <w:unhideWhenUsed/>
     <w:qFormat/>
@@ -30349,11 +30713,11 @@
       <w:szCs w:val="28"/>
     </w:rPr>
   </w:style>
-  <w:style w:type="paragraph" w:styleId="142">
+  <w:style w:type="paragraph" w:styleId="830">
     <w:name w:val="Heading 4"/>
-    <w:basedOn w:val="664"/>
-    <w:next w:val="664"/>
-    <w:link w:val="153"/>
+    <w:basedOn w:val="886"/>
+    <w:next w:val="886"/>
+    <w:link w:val="840"/>
     <w:uiPriority w:val="9"/>
     <w:unhideWhenUsed/>
     <w:qFormat/>
@@ -30372,11 +30736,11 @@
       <w:color w:val="0f4761" w:themeColor="accent1" w:themeShade="BF"/>
     </w:rPr>
   </w:style>
-  <w:style w:type="paragraph" w:styleId="143">
+  <w:style w:type="paragraph" w:styleId="831">
     <w:name w:val="Heading 5"/>
-    <w:basedOn w:val="664"/>
-    <w:next w:val="664"/>
-    <w:link w:val="154"/>
+    <w:basedOn w:val="886"/>
+    <w:next w:val="886"/>
+    <w:link w:val="841"/>
     <w:uiPriority w:val="9"/>
     <w:unhideWhenUsed/>
     <w:qFormat/>
@@ -30393,11 +30757,11 @@
       <w:color w:val="0f4761" w:themeColor="accent1" w:themeShade="BF"/>
     </w:rPr>
   </w:style>
-  <w:style w:type="paragraph" w:styleId="144">
+  <w:style w:type="paragraph" w:styleId="832">
     <w:name w:val="Heading 6"/>
-    <w:basedOn w:val="664"/>
-    <w:next w:val="664"/>
-    <w:link w:val="155"/>
+    <w:basedOn w:val="886"/>
+    <w:next w:val="886"/>
+    <w:link w:val="842"/>
     <w:uiPriority w:val="9"/>
     <w:unhideWhenUsed/>
     <w:qFormat/>
@@ -30416,11 +30780,11 @@
       <w:color w:val="595959" w:themeColor="text1" w:themeTint="A6"/>
     </w:rPr>
   </w:style>
-  <w:style w:type="paragraph" w:styleId="145">
+  <w:style w:type="paragraph" w:styleId="833">
     <w:name w:val="Heading 7"/>
-    <w:basedOn w:val="664"/>
-    <w:next w:val="664"/>
-    <w:link w:val="156"/>
+    <w:basedOn w:val="886"/>
+    <w:next w:val="886"/>
+    <w:link w:val="843"/>
     <w:uiPriority w:val="9"/>
     <w:unhideWhenUsed/>
     <w:qFormat/>
@@ -30437,11 +30801,11 @@
       <w:color w:val="595959" w:themeColor="text1" w:themeTint="A6"/>
     </w:rPr>
   </w:style>
-  <w:style w:type="paragraph" w:styleId="146">
+  <w:style w:type="paragraph" w:styleId="834">
     <w:name w:val="Heading 8"/>
-    <w:basedOn w:val="664"/>
-    <w:next w:val="664"/>
-    <w:link w:val="157"/>
+    <w:basedOn w:val="886"/>
+    <w:next w:val="886"/>
+    <w:link w:val="844"/>
     <w:uiPriority w:val="9"/>
     <w:unhideWhenUsed/>
     <w:qFormat/>
@@ -30460,11 +30824,11 @@
       <w:color w:val="272727" w:themeColor="text1" w:themeTint="D8"/>
     </w:rPr>
   </w:style>
-  <w:style w:type="paragraph" w:styleId="147">
+  <w:style w:type="paragraph" w:styleId="835">
     <w:name w:val="Heading 9"/>
-    <w:basedOn w:val="664"/>
-    <w:next w:val="664"/>
-    <w:link w:val="158"/>
+    <w:basedOn w:val="886"/>
+    <w:next w:val="886"/>
+    <w:link w:val="845"/>
     <w:uiPriority w:val="9"/>
     <w:unhideWhenUsed/>
     <w:qFormat/>
@@ -30483,7 +30847,7 @@
       <w:color w:val="272727" w:themeColor="text1" w:themeTint="D8"/>
     </w:rPr>
   </w:style>
-  <w:style w:type="character" w:styleId="148" w:default="1">
+  <w:style w:type="character" w:styleId="836" w:default="1">
     <w:name w:val="Default Paragraph Font"/>
     <w:uiPriority w:val="1"/>
     <w:semiHidden/>
@@ -30494,10 +30858,10 @@
       <w:ind/>
     </w:pPr>
   </w:style>
-  <w:style w:type="character" w:styleId="150">
+  <w:style w:type="character" w:styleId="837">
     <w:name w:val="Heading 1 Char"/>
-    <w:basedOn w:val="148"/>
-    <w:link w:val="139"/>
+    <w:basedOn w:val="836"/>
+    <w:link w:val="827"/>
     <w:uiPriority w:val="9"/>
     <w:pPr>
       <w:pBdr/>
@@ -30511,10 +30875,10 @@
       <w:szCs w:val="40"/>
     </w:rPr>
   </w:style>
-  <w:style w:type="character" w:styleId="151">
+  <w:style w:type="character" w:styleId="838">
     <w:name w:val="Heading 2 Char"/>
-    <w:basedOn w:val="148"/>
-    <w:link w:val="140"/>
+    <w:basedOn w:val="836"/>
+    <w:link w:val="828"/>
     <w:uiPriority w:val="9"/>
     <w:pPr>
       <w:pBdr/>
@@ -30528,10 +30892,10 @@
       <w:szCs w:val="32"/>
     </w:rPr>
   </w:style>
-  <w:style w:type="character" w:styleId="152">
+  <w:style w:type="character" w:styleId="839">
     <w:name w:val="Heading 3 Char"/>
-    <w:basedOn w:val="148"/>
-    <w:link w:val="141"/>
+    <w:basedOn w:val="836"/>
+    <w:link w:val="829"/>
     <w:uiPriority w:val="9"/>
     <w:pPr>
       <w:pBdr/>
@@ -30545,10 +30909,10 @@
       <w:szCs w:val="28"/>
     </w:rPr>
   </w:style>
-  <w:style w:type="character" w:styleId="153">
+  <w:style w:type="character" w:styleId="840">
     <w:name w:val="Heading 4 Char"/>
-    <w:basedOn w:val="148"/>
-    <w:link w:val="142"/>
+    <w:basedOn w:val="836"/>
+    <w:link w:val="830"/>
     <w:uiPriority w:val="9"/>
     <w:pPr>
       <w:pBdr/>
@@ -30562,10 +30926,10 @@
       <w:color w:val="0f4761" w:themeColor="accent1" w:themeShade="BF"/>
     </w:rPr>
   </w:style>
-  <w:style w:type="character" w:styleId="154">
+  <w:style w:type="character" w:styleId="841">
     <w:name w:val="Heading 5 Char"/>
-    <w:basedOn w:val="148"/>
-    <w:link w:val="143"/>
+    <w:basedOn w:val="836"/>
+    <w:link w:val="831"/>
     <w:uiPriority w:val="9"/>
     <w:pPr>
       <w:pBdr/>
@@ -30577,10 +30941,10 @@
       <w:color w:val="0f4761" w:themeColor="accent1" w:themeShade="BF"/>
     </w:rPr>
   </w:style>
-  <w:style w:type="character" w:styleId="155">
+  <w:style w:type="character" w:styleId="842">
     <w:name w:val="Heading 6 Char"/>
-    <w:basedOn w:val="148"/>
-    <w:link w:val="144"/>
+    <w:basedOn w:val="836"/>
+    <w:link w:val="832"/>
     <w:uiPriority w:val="9"/>
     <w:pPr>
       <w:pBdr/>
@@ -30594,10 +30958,10 @@
       <w:color w:val="595959" w:themeColor="text1" w:themeTint="A6"/>
     </w:rPr>
   </w:style>
-  <w:style w:type="character" w:styleId="156">
+  <w:style w:type="character" w:styleId="843">
     <w:name w:val="Heading 7 Char"/>
-    <w:basedOn w:val="148"/>
-    <w:link w:val="145"/>
+    <w:basedOn w:val="836"/>
+    <w:link w:val="833"/>
     <w:uiPriority w:val="9"/>
     <w:pPr>
       <w:pBdr/>
@@ -30609,10 +30973,10 @@
       <w:color w:val="595959" w:themeColor="text1" w:themeTint="A6"/>
     </w:rPr>
   </w:style>
-  <w:style w:type="character" w:styleId="157">
+  <w:style w:type="character" w:styleId="844">
     <w:name w:val="Heading 8 Char"/>
-    <w:basedOn w:val="148"/>
-    <w:link w:val="146"/>
+    <w:basedOn w:val="836"/>
+    <w:link w:val="834"/>
     <w:uiPriority w:val="9"/>
     <w:pPr>
       <w:pBdr/>
@@ -30626,10 +30990,10 @@
       <w:color w:val="272727" w:themeColor="text1" w:themeTint="D8"/>
     </w:rPr>
   </w:style>
-  <w:style w:type="character" w:styleId="158">
+  <w:style w:type="character" w:styleId="845">
     <w:name w:val="Heading 9 Char"/>
-    <w:basedOn w:val="148"/>
-    <w:link w:val="147"/>
+    <w:basedOn w:val="836"/>
+    <w:link w:val="835"/>
     <w:uiPriority w:val="9"/>
     <w:pPr>
       <w:pBdr/>
@@ -30643,11 +31007,11 @@
       <w:color w:val="272727" w:themeColor="text1" w:themeTint="D8"/>
     </w:rPr>
   </w:style>
-  <w:style w:type="paragraph" w:styleId="159">
+  <w:style w:type="paragraph" w:styleId="846">
     <w:name w:val="Title"/>
-    <w:basedOn w:val="664"/>
-    <w:next w:val="664"/>
-    <w:link w:val="160"/>
+    <w:basedOn w:val="886"/>
+    <w:next w:val="886"/>
+    <w:link w:val="847"/>
     <w:uiPriority w:val="10"/>
     <w:qFormat/>
     <w:pPr>
@@ -30663,10 +31027,10 @@
       <w:szCs w:val="56"/>
     </w:rPr>
   </w:style>
-  <w:style w:type="character" w:styleId="160">
+  <w:style w:type="character" w:styleId="847">
     <w:name w:val="Title Char"/>
-    <w:basedOn w:val="148"/>
-    <w:link w:val="159"/>
+    <w:basedOn w:val="836"/>
+    <w:link w:val="846"/>
     <w:uiPriority w:val="10"/>
     <w:pPr>
       <w:pBdr/>
@@ -30680,11 +31044,11 @@
       <w:szCs w:val="56"/>
     </w:rPr>
   </w:style>
-  <w:style w:type="paragraph" w:styleId="161">
+  <w:style w:type="paragraph" w:styleId="848">
     <w:name w:val="Subtitle"/>
-    <w:basedOn w:val="664"/>
-    <w:next w:val="664"/>
-    <w:link w:val="162"/>
+    <w:basedOn w:val="886"/>
+    <w:next w:val="886"/>
+    <w:link w:val="849"/>
     <w:uiPriority w:val="11"/>
     <w:qFormat/>
     <w:pPr>
@@ -30702,10 +31066,10 @@
       <w:szCs w:val="28"/>
     </w:rPr>
   </w:style>
-  <w:style w:type="character" w:styleId="162">
+  <w:style w:type="character" w:styleId="849">
     <w:name w:val="Subtitle Char"/>
-    <w:basedOn w:val="148"/>
-    <w:link w:val="161"/>
+    <w:basedOn w:val="836"/>
+    <w:link w:val="848"/>
     <w:uiPriority w:val="11"/>
     <w:pPr>
       <w:pBdr/>
@@ -30719,11 +31083,11 @@
       <w:szCs w:val="28"/>
     </w:rPr>
   </w:style>
-  <w:style w:type="paragraph" w:styleId="163">
+  <w:style w:type="paragraph" w:styleId="850">
     <w:name w:val="Quote"/>
-    <w:basedOn w:val="664"/>
-    <w:next w:val="664"/>
-    <w:link w:val="164"/>
+    <w:basedOn w:val="886"/>
+    <w:next w:val="886"/>
+    <w:link w:val="851"/>
     <w:uiPriority w:val="29"/>
     <w:qFormat/>
     <w:pPr>
@@ -30738,10 +31102,10 @@
       <w:color w:val="404040" w:themeColor="text1" w:themeTint="BF"/>
     </w:rPr>
   </w:style>
-  <w:style w:type="character" w:styleId="164">
+  <w:style w:type="character" w:styleId="851">
     <w:name w:val="Quote Char"/>
-    <w:basedOn w:val="148"/>
-    <w:link w:val="163"/>
+    <w:basedOn w:val="836"/>
+    <w:link w:val="850"/>
     <w:uiPriority w:val="29"/>
     <w:pPr>
       <w:pBdr/>
@@ -30754,9 +31118,9 @@
       <w:color w:val="404040" w:themeColor="text1" w:themeTint="BF"/>
     </w:rPr>
   </w:style>
-  <w:style w:type="character" w:styleId="166">
+  <w:style w:type="character" w:styleId="852">
     <w:name w:val="Intense Emphasis"/>
-    <w:basedOn w:val="148"/>
+    <w:basedOn w:val="836"/>
     <w:uiPriority w:val="21"/>
     <w:qFormat/>
     <w:pPr>
@@ -30770,11 +31134,11 @@
       <w:color w:val="0f4761" w:themeColor="accent1" w:themeShade="BF"/>
     </w:rPr>
   </w:style>
-  <w:style w:type="paragraph" w:styleId="167">
+  <w:style w:type="paragraph" w:styleId="853">
     <w:name w:val="Intense Quote"/>
-    <w:basedOn w:val="664"/>
-    <w:next w:val="664"/>
-    <w:link w:val="168"/>
+    <w:basedOn w:val="886"/>
+    <w:next w:val="886"/>
+    <w:link w:val="854"/>
     <w:uiPriority w:val="30"/>
     <w:qFormat/>
     <w:pPr>
@@ -30792,10 +31156,10 @@
       <w:color w:val="0f4761" w:themeColor="accent1" w:themeShade="BF"/>
     </w:rPr>
   </w:style>
-  <w:style w:type="character" w:styleId="168">
+  <w:style w:type="character" w:styleId="854">
     <w:name w:val="Intense Quote Char"/>
-    <w:basedOn w:val="148"/>
-    <w:link w:val="167"/>
+    <w:basedOn w:val="836"/>
+    <w:link w:val="853"/>
     <w:uiPriority w:val="30"/>
     <w:pPr>
       <w:pBdr/>
@@ -30808,9 +31172,9 @@
       <w:color w:val="0f4761" w:themeColor="accent1" w:themeShade="BF"/>
     </w:rPr>
   </w:style>
-  <w:style w:type="character" w:styleId="169">
+  <w:style w:type="character" w:styleId="855">
     <w:name w:val="Intense Reference"/>
-    <w:basedOn w:val="148"/>
+    <w:basedOn w:val="836"/>
     <w:uiPriority w:val="32"/>
     <w:qFormat/>
     <w:pPr>
@@ -30826,9 +31190,9 @@
       <w:spacing w:val="5"/>
     </w:rPr>
   </w:style>
-  <w:style w:type="character" w:styleId="171">
+  <w:style w:type="character" w:styleId="856">
     <w:name w:val="Subtle Emphasis"/>
-    <w:basedOn w:val="148"/>
+    <w:basedOn w:val="836"/>
     <w:uiPriority w:val="19"/>
     <w:qFormat/>
     <w:pPr>
@@ -30842,9 +31206,9 @@
       <w:color w:val="404040" w:themeColor="text1" w:themeTint="BF"/>
     </w:rPr>
   </w:style>
-  <w:style w:type="character" w:styleId="172">
+  <w:style w:type="character" w:styleId="857">
     <w:name w:val="Emphasis"/>
-    <w:basedOn w:val="148"/>
+    <w:basedOn w:val="836"/>
     <w:uiPriority w:val="20"/>
     <w:qFormat/>
     <w:pPr>
@@ -30857,9 +31221,9 @@
       <w:iCs/>
     </w:rPr>
   </w:style>
-  <w:style w:type="character" w:styleId="173">
+  <w:style w:type="character" w:styleId="858">
     <w:name w:val="Strong"/>
-    <w:basedOn w:val="148"/>
+    <w:basedOn w:val="836"/>
     <w:uiPriority w:val="22"/>
     <w:qFormat/>
     <w:pPr>
@@ -30872,9 +31236,9 @@
       <w:bCs/>
     </w:rPr>
   </w:style>
-  <w:style w:type="character" w:styleId="174">
+  <w:style w:type="character" w:styleId="859">
     <w:name w:val="Subtle Reference"/>
-    <w:basedOn w:val="148"/>
+    <w:basedOn w:val="836"/>
     <w:uiPriority w:val="31"/>
     <w:qFormat/>
     <w:pPr>
@@ -30887,9 +31251,9 @@
       <w:color w:val="5a5a5a" w:themeColor="text1" w:themeTint="A5"/>
     </w:rPr>
   </w:style>
-  <w:style w:type="character" w:styleId="175">
+  <w:style w:type="character" w:styleId="860">
     <w:name w:val="Book Title"/>
-    <w:basedOn w:val="148"/>
+    <w:basedOn w:val="836"/>
     <w:uiPriority w:val="33"/>
     <w:qFormat/>
     <w:pPr>
@@ -30905,10 +31269,10 @@
       <w:spacing w:val="5"/>
     </w:rPr>
   </w:style>
-  <w:style w:type="paragraph" w:styleId="176">
+  <w:style w:type="paragraph" w:styleId="861">
     <w:name w:val="Header"/>
-    <w:basedOn w:val="664"/>
-    <w:link w:val="177"/>
+    <w:basedOn w:val="886"/>
+    <w:link w:val="862"/>
     <w:uiPriority w:val="99"/>
     <w:unhideWhenUsed/>
     <w:pPr>
@@ -30921,10 +31285,10 @@
       <w:ind/>
     </w:pPr>
   </w:style>
-  <w:style w:type="character" w:styleId="177">
+  <w:style w:type="character" w:styleId="862">
     <w:name w:val="Header Char"/>
-    <w:basedOn w:val="148"/>
-    <w:link w:val="176"/>
+    <w:basedOn w:val="836"/>
+    <w:link w:val="861"/>
     <w:uiPriority w:val="99"/>
     <w:pPr>
       <w:pBdr/>
@@ -30932,10 +31296,10 @@
       <w:ind/>
     </w:pPr>
   </w:style>
-  <w:style w:type="paragraph" w:styleId="178">
+  <w:style w:type="paragraph" w:styleId="863">
     <w:name w:val="Footer"/>
-    <w:basedOn w:val="664"/>
-    <w:link w:val="179"/>
+    <w:basedOn w:val="886"/>
+    <w:link w:val="864"/>
     <w:uiPriority w:val="99"/>
     <w:unhideWhenUsed/>
     <w:pPr>
@@ -30948,10 +31312,10 @@
       <w:ind/>
     </w:pPr>
   </w:style>
-  <w:style w:type="character" w:styleId="179">
+  <w:style w:type="character" w:styleId="864">
     <w:name w:val="Footer Char"/>
-    <w:basedOn w:val="148"/>
-    <w:link w:val="178"/>
+    <w:basedOn w:val="836"/>
+    <w:link w:val="863"/>
     <w:uiPriority w:val="99"/>
     <w:pPr>
       <w:pBdr/>
@@ -30959,10 +31323,10 @@
       <w:ind/>
     </w:pPr>
   </w:style>
-  <w:style w:type="paragraph" w:styleId="180">
+  <w:style w:type="paragraph" w:styleId="865">
     <w:name w:val="Caption"/>
-    <w:basedOn w:val="664"/>
-    <w:next w:val="664"/>
+    <w:basedOn w:val="886"/>
+    <w:next w:val="886"/>
     <w:uiPriority w:val="35"/>
     <w:unhideWhenUsed/>
     <w:qFormat/>
@@ -30979,10 +31343,10 @@
       <w:szCs w:val="18"/>
     </w:rPr>
   </w:style>
-  <w:style w:type="paragraph" w:styleId="181">
+  <w:style w:type="paragraph" w:styleId="866">
     <w:name w:val="footnote text"/>
-    <w:basedOn w:val="664"/>
-    <w:link w:val="182"/>
+    <w:basedOn w:val="886"/>
+    <w:link w:val="867"/>
     <w:uiPriority w:val="99"/>
     <w:semiHidden/>
     <w:unhideWhenUsed/>
@@ -30996,10 +31360,10 @@
       <w:szCs w:val="20"/>
     </w:rPr>
   </w:style>
-  <w:style w:type="character" w:styleId="182">
+  <w:style w:type="character" w:styleId="867">
     <w:name w:val="Footnote Text Char"/>
-    <w:basedOn w:val="148"/>
-    <w:link w:val="181"/>
+    <w:basedOn w:val="836"/>
+    <w:link w:val="866"/>
     <w:uiPriority w:val="99"/>
     <w:semiHidden/>
     <w:pPr>
@@ -31012,9 +31376,9 @@
       <w:szCs w:val="20"/>
     </w:rPr>
   </w:style>
-  <w:style w:type="character" w:styleId="183">
+  <w:style w:type="character" w:styleId="868">
     <w:name w:val="footnote reference"/>
-    <w:basedOn w:val="148"/>
+    <w:basedOn w:val="836"/>
     <w:uiPriority w:val="99"/>
     <w:semiHidden/>
     <w:unhideWhenUsed/>
@@ -31027,10 +31391,10 @@
       <w:vertAlign w:val="superscript"/>
     </w:rPr>
   </w:style>
-  <w:style w:type="paragraph" w:styleId="184">
+  <w:style w:type="paragraph" w:styleId="869">
     <w:name w:val="endnote text"/>
-    <w:basedOn w:val="664"/>
-    <w:link w:val="185"/>
+    <w:basedOn w:val="886"/>
+    <w:link w:val="870"/>
     <w:uiPriority w:val="99"/>
     <w:semiHidden/>
     <w:unhideWhenUsed/>
@@ -31044,10 +31408,10 @@
       <w:szCs w:val="20"/>
     </w:rPr>
   </w:style>
-  <w:style w:type="character" w:styleId="185">
+  <w:style w:type="character" w:styleId="870">
     <w:name w:val="Endnote Text Char"/>
-    <w:basedOn w:val="148"/>
-    <w:link w:val="184"/>
+    <w:basedOn w:val="836"/>
+    <w:link w:val="869"/>
     <w:uiPriority w:val="99"/>
     <w:semiHidden/>
     <w:pPr>
@@ -31060,9 +31424,9 @@
       <w:szCs w:val="20"/>
     </w:rPr>
   </w:style>
-  <w:style w:type="character" w:styleId="186">
+  <w:style w:type="character" w:styleId="871">
     <w:name w:val="endnote reference"/>
-    <w:basedOn w:val="148"/>
+    <w:basedOn w:val="836"/>
     <w:uiPriority w:val="99"/>
     <w:semiHidden/>
     <w:unhideWhenUsed/>
@@ -31075,9 +31439,9 @@
       <w:vertAlign w:val="superscript"/>
     </w:rPr>
   </w:style>
-  <w:style w:type="character" w:styleId="187">
+  <w:style w:type="character" w:styleId="872">
     <w:name w:val="Hyperlink"/>
-    <w:basedOn w:val="148"/>
+    <w:basedOn w:val="836"/>
     <w:uiPriority w:val="99"/>
     <w:unhideWhenUsed/>
     <w:pPr>
@@ -31090,9 +31454,9 @@
       <w:u w:val="single"/>
     </w:rPr>
   </w:style>
-  <w:style w:type="character" w:styleId="188">
+  <w:style w:type="character" w:styleId="873">
     <w:name w:val="FollowedHyperlink"/>
-    <w:basedOn w:val="148"/>
+    <w:basedOn w:val="836"/>
     <w:uiPriority w:val="99"/>
     <w:semiHidden/>
     <w:unhideWhenUsed/>
@@ -31106,10 +31470,10 @@
       <w:u w:val="single"/>
     </w:rPr>
   </w:style>
-  <w:style w:type="paragraph" w:styleId="189">
+  <w:style w:type="paragraph" w:styleId="874">
     <w:name w:val="toc 1"/>
-    <w:basedOn w:val="664"/>
-    <w:next w:val="664"/>
+    <w:basedOn w:val="886"/>
+    <w:next w:val="886"/>
     <w:uiPriority w:val="39"/>
     <w:unhideWhenUsed/>
     <w:pPr>
@@ -31118,10 +31482,10 @@
       <w:ind/>
     </w:pPr>
   </w:style>
-  <w:style w:type="paragraph" w:styleId="190">
+  <w:style w:type="paragraph" w:styleId="875">
     <w:name w:val="toc 2"/>
-    <w:basedOn w:val="664"/>
-    <w:next w:val="664"/>
+    <w:basedOn w:val="886"/>
+    <w:next w:val="886"/>
     <w:uiPriority w:val="39"/>
     <w:unhideWhenUsed/>
     <w:pPr>
@@ -31130,10 +31494,10 @@
       <w:ind w:left="220"/>
     </w:pPr>
   </w:style>
-  <w:style w:type="paragraph" w:styleId="191">
+  <w:style w:type="paragraph" w:styleId="876">
     <w:name w:val="toc 3"/>
-    <w:basedOn w:val="664"/>
-    <w:next w:val="664"/>
+    <w:basedOn w:val="886"/>
+    <w:next w:val="886"/>
     <w:uiPriority w:val="39"/>
     <w:unhideWhenUsed/>
     <w:pPr>
@@ -31142,10 +31506,10 @@
       <w:ind w:left="440"/>
     </w:pPr>
   </w:style>
-  <w:style w:type="paragraph" w:styleId="192">
+  <w:style w:type="paragraph" w:styleId="877">
     <w:name w:val="toc 4"/>
-    <w:basedOn w:val="664"/>
-    <w:next w:val="664"/>
+    <w:basedOn w:val="886"/>
+    <w:next w:val="886"/>
     <w:uiPriority w:val="39"/>
     <w:unhideWhenUsed/>
     <w:pPr>
@@ -31154,10 +31518,10 @@
       <w:ind w:left="660"/>
     </w:pPr>
   </w:style>
-  <w:style w:type="paragraph" w:styleId="193">
+  <w:style w:type="paragraph" w:styleId="878">
     <w:name w:val="toc 5"/>
-    <w:basedOn w:val="664"/>
-    <w:next w:val="664"/>
+    <w:basedOn w:val="886"/>
+    <w:next w:val="886"/>
     <w:uiPriority w:val="39"/>
     <w:unhideWhenUsed/>
     <w:pPr>
@@ -31166,10 +31530,10 @@
       <w:ind w:left="880"/>
     </w:pPr>
   </w:style>
-  <w:style w:type="paragraph" w:styleId="194">
+  <w:style w:type="paragraph" w:styleId="879">
     <w:name w:val="toc 6"/>
-    <w:basedOn w:val="664"/>
-    <w:next w:val="664"/>
+    <w:basedOn w:val="886"/>
+    <w:next w:val="886"/>
     <w:uiPriority w:val="39"/>
     <w:unhideWhenUsed/>
     <w:pPr>
@@ -31178,10 +31542,10 @@
       <w:ind w:left="1100"/>
     </w:pPr>
   </w:style>
-  <w:style w:type="paragraph" w:styleId="195">
+  <w:style w:type="paragraph" w:styleId="880">
     <w:name w:val="toc 7"/>
-    <w:basedOn w:val="664"/>
-    <w:next w:val="664"/>
+    <w:basedOn w:val="886"/>
+    <w:next w:val="886"/>
     <w:uiPriority w:val="39"/>
     <w:unhideWhenUsed/>
     <w:pPr>
@@ -31190,10 +31554,10 @@
       <w:ind w:left="1320"/>
     </w:pPr>
   </w:style>
-  <w:style w:type="paragraph" w:styleId="196">
+  <w:style w:type="paragraph" w:styleId="881">
     <w:name w:val="toc 8"/>
-    <w:basedOn w:val="664"/>
-    <w:next w:val="664"/>
+    <w:basedOn w:val="886"/>
+    <w:next w:val="886"/>
     <w:uiPriority w:val="39"/>
     <w:unhideWhenUsed/>
     <w:pPr>
@@ -31202,10 +31566,10 @@
       <w:ind w:left="1540"/>
     </w:pPr>
   </w:style>
-  <w:style w:type="paragraph" w:styleId="197">
+  <w:style w:type="paragraph" w:styleId="882">
     <w:name w:val="toc 9"/>
-    <w:basedOn w:val="664"/>
-    <w:next w:val="664"/>
+    <w:basedOn w:val="886"/>
+    <w:next w:val="886"/>
     <w:uiPriority w:val="39"/>
     <w:unhideWhenUsed/>
     <w:pPr>
@@ -31214,9 +31578,9 @@
       <w:ind w:left="1760"/>
     </w:pPr>
   </w:style>
-  <w:style w:type="character" w:styleId="198">
+  <w:style w:type="character" w:styleId="883">
     <w:name w:val="Placeholder Text"/>
-    <w:basedOn w:val="148"/>
+    <w:basedOn w:val="836"/>
     <w:uiPriority w:val="99"/>
     <w:semiHidden/>
     <w:pPr>
@@ -31228,7 +31592,7 @@
       <w:color w:val="666666"/>
     </w:rPr>
   </w:style>
-  <w:style w:type="paragraph" w:styleId="208">
+  <w:style w:type="paragraph" w:styleId="884">
     <w:name w:val="TOC Heading"/>
     <w:uiPriority w:val="39"/>
     <w:unhideWhenUsed/>
@@ -31238,10 +31602,10 @@
       <w:ind/>
     </w:pPr>
   </w:style>
-  <w:style w:type="paragraph" w:styleId="209">
+  <w:style w:type="paragraph" w:styleId="885">
     <w:name w:val="table of figures"/>
-    <w:basedOn w:val="664"/>
-    <w:next w:val="664"/>
+    <w:basedOn w:val="886"/>
+    <w:next w:val="886"/>
     <w:uiPriority w:val="99"/>
     <w:unhideWhenUsed/>
     <w:pPr>
@@ -31250,7 +31614,7 @@
       <w:ind/>
     </w:pPr>
   </w:style>
-  <w:style w:type="paragraph" w:styleId="664" w:default="1">
+  <w:style w:type="paragraph" w:styleId="886" w:default="1">
     <w:name w:val="Normal"/>
     <w:qFormat/>
     <w:pPr>
@@ -31259,7 +31623,7 @@
       <w:ind/>
     </w:pPr>
   </w:style>
-  <w:style w:type="table" w:styleId="665" w:default="1">
+  <w:style w:type="table" w:styleId="887" w:default="1">
     <w:name w:val="Normal Table"/>
     <w:uiPriority w:val="99"/>
     <w:semiHidden/>
@@ -31452,7 +31816,7 @@
       </w:tcPr>
     </w:tblStylePr>
   </w:style>
-  <w:style w:type="numbering" w:styleId="666" w:default="1">
+  <w:style w:type="numbering" w:styleId="888" w:default="1">
     <w:name w:val="No List"/>
     <w:uiPriority w:val="99"/>
     <w:semiHidden/>
@@ -31463,9 +31827,9 @@
       <w:ind/>
     </w:pPr>
   </w:style>
-  <w:style w:type="paragraph" w:styleId="667">
+  <w:style w:type="paragraph" w:styleId="889">
     <w:name w:val="No Spacing"/>
-    <w:basedOn w:val="664"/>
+    <w:basedOn w:val="886"/>
     <w:uiPriority w:val="1"/>
     <w:qFormat/>
     <w:pPr>
@@ -31474,9 +31838,9 @@
       <w:ind/>
     </w:pPr>
   </w:style>
-  <w:style w:type="paragraph" w:styleId="668">
+  <w:style w:type="paragraph" w:styleId="890">
     <w:name w:val="List Paragraph"/>
-    <w:basedOn w:val="664"/>
+    <w:basedOn w:val="886"/>
     <w:uiPriority w:val="34"/>
     <w:qFormat/>
     <w:pPr>

</xml_diff>